<commit_message>
docs: complete grounded architecture details
</commit_message>
<xml_diff>
--- a/docs/VESKIFY_SDD_v1.2.1.docx
+++ b/docs/VESKIFY_SDD_v1.2.1.docx
@@ -906,51 +906,51 @@
           <w:sz w:val="18"/>
           <w:szCs w:val="18"/>
         </w:rPr>
-        <w:t>The useful lesson from capability-grounded storefront generators, including commercetools</w:t>
-      </w:r>
-    </w:p>
-    <w:p>
-      <w:pPr/>
-      <w:r>
-        <w:rPr>
-          <w:rFonts w:ascii="Helvetica Light" w:hAnsi="Helvetica Light" w:cs="Helvetica Light"/>
-          <w:sz w:val="18"/>
-          <w:szCs w:val="18"/>
-        </w:rPr>
-        <w:t>reference material, is the workflow: retrieve approved capabilities, compose within them, validate</w:t>
-      </w:r>
-    </w:p>
-    <w:p>
-      <w:pPr/>
-      <w:r>
-        <w:rPr>
-          <w:rFonts w:ascii="Helvetica Light" w:hAnsi="Helvetica Light" w:cs="Helvetica Light"/>
-          <w:sz w:val="18"/>
-          <w:szCs w:val="18"/>
-        </w:rPr>
-        <w:t>the result and compile it deterministically. Veskify is not a clone of another generator.</w:t>
-      </w:r>
-    </w:p>
-    <w:p>
-      <w:pPr/>
-      <w:r>
-        <w:rPr>
-          <w:rFonts w:ascii="Helvetica Light" w:hAnsi="Helvetica Light" w:cs="Helvetica Light"/>
-          <w:sz w:val="18"/>
-          <w:szCs w:val="18"/>
-        </w:rPr>
-        <w:t>Veskify generates, governs and persists merchant-editable design state for Vesko Storefront Studio</w:t>
-      </w:r>
-    </w:p>
-    <w:p>
-      <w:pPr/>
-      <w:r>
-        <w:rPr>
-          <w:rFonts w:ascii="Helvetica Light" w:hAnsi="Helvetica Light" w:cs="Helvetica Light"/>
-          <w:sz w:val="18"/>
-          <w:szCs w:val="18"/>
-        </w:rPr>
-        <w:t>while Vesko remains authoritative for commerce truth.</w:t>
+        <w:t>commercetools uses AI primarily to help developers generate storefront software. Veskify uses AI to</w:t>
+      </w:r>
+    </w:p>
+    <w:p>
+      <w:pPr/>
+      <w:r>
+        <w:rPr>
+          <w:rFonts w:ascii="Helvetica Light" w:hAnsi="Helvetica Light" w:cs="Helvetica Light"/>
+          <w:sz w:val="18"/>
+          <w:szCs w:val="18"/>
+        </w:rPr>
+        <w:t>generate and continuously govern merchant-editable storefront design state. Veskify is not a</w:t>
+      </w:r>
+    </w:p>
+    <w:p>
+      <w:pPr/>
+      <w:r>
+        <w:rPr>
+          <w:rFonts w:ascii="Helvetica Light" w:hAnsi="Helvetica Light" w:cs="Helvetica Light"/>
+          <w:sz w:val="18"/>
+          <w:szCs w:val="18"/>
+        </w:rPr>
+        <w:t>commercetools clone. The useful lesson from capability-grounded storefront generators is the</w:t>
+      </w:r>
+    </w:p>
+    <w:p>
+      <w:pPr/>
+      <w:r>
+        <w:rPr>
+          <w:rFonts w:ascii="Helvetica Light" w:hAnsi="Helvetica Light" w:cs="Helvetica Light"/>
+          <w:sz w:val="18"/>
+          <w:szCs w:val="18"/>
+        </w:rPr>
+        <w:t>workflow: discover available capabilities, retrieve exact schemas, plan, validate and implement</w:t>
+      </w:r>
+    </w:p>
+    <w:p>
+      <w:pPr/>
+      <w:r>
+        <w:rPr>
+          <w:rFonts w:ascii="Helvetica Light" w:hAnsi="Helvetica Light" w:cs="Helvetica Light"/>
+          <w:sz w:val="18"/>
+          <w:szCs w:val="18"/>
+        </w:rPr>
+        <w:t>deterministically.</w:t>
       </w:r>
     </w:p>
     <w:p/>
@@ -1088,6 +1088,28 @@
         <w:t>second source of truth. It may select only capabilities supplied by the current repository.</w:t>
       </w:r>
     </w:p>
+    <w:p>
+      <w:pPr/>
+      <w:r>
+        <w:rPr>
+          <w:rFonts w:ascii="Helvetica Light" w:hAnsi="Helvetica Light" w:cs="Helvetica Light"/>
+          <w:sz w:val="18"/>
+          <w:szCs w:val="18"/>
+        </w:rPr>
+        <w:t>The AI MUST NOT invent components, component variants, props, slots, bindings, asset roles, page</w:t>
+      </w:r>
+    </w:p>
+    <w:p>
+      <w:pPr/>
+      <w:r>
+        <w:rPr>
+          <w:rFonts w:ascii="Helvetica Light" w:hAnsi="Helvetica Light" w:cs="Helvetica Light"/>
+          <w:sz w:val="18"/>
+          <w:szCs w:val="18"/>
+        </w:rPr>
+        <w:t>recipes, adapter capabilities, operation types or versions.</w:t>
+      </w:r>
+    </w:p>
     <w:p/>
     <w:p>
       <w:pPr/>
@@ -1379,6 +1401,152 @@
           <w:sz w:val="18"/>
           <w:szCs w:val="18"/>
         </w:rPr>
+        <w:t>One merchant instruction must create a materially new coordinated storefront across the shared</w:t>
+      </w:r>
+    </w:p>
+    <w:p>
+      <w:pPr/>
+      <w:r>
+        <w:rPr>
+          <w:rFonts w:ascii="Helvetica Light" w:hAnsi="Helvetica Light" w:cs="Helvetica Light"/>
+          <w:sz w:val="18"/>
+          <w:szCs w:val="18"/>
+        </w:rPr>
+        <w:t>header, navigation, announcement bar where present, footer, homepage, collection and representative</w:t>
+      </w:r>
+    </w:p>
+    <w:p>
+      <w:pPr/>
+      <w:r>
+        <w:rPr>
+          <w:rFonts w:ascii="Helvetica Light" w:hAnsi="Helvetica Light" w:cs="Helvetica Light"/>
+          <w:sz w:val="18"/>
+          <w:szCs w:val="18"/>
+        </w:rPr>
+        <w:t>product-detail pages. Objective composition evidence includes:</w:t>
+      </w:r>
+    </w:p>
+    <w:p/>
+    <w:p>
+      <w:pPr/>
+      <w:r>
+        <w:rPr>
+          <w:rFonts w:ascii="Helvetica Light" w:hAnsi="Helvetica Light" w:cs="Helvetica Light"/>
+          <w:sz w:val="18"/>
+          <w:szCs w:val="18"/>
+        </w:rPr>
+        <w:t>| Area | Material changes required |</w:t>
+      </w:r>
+    </w:p>
+    <w:p>
+      <w:pPr/>
+      <w:r>
+        <w:rPr>
+          <w:rFonts w:ascii="Helvetica Light" w:hAnsi="Helvetica Light" w:cs="Helvetica Light"/>
+          <w:sz w:val="18"/>
+          <w:szCs w:val="18"/>
+        </w:rPr>
+        <w:t>| --- | --- |</w:t>
+      </w:r>
+    </w:p>
+    <w:p>
+      <w:pPr/>
+      <w:r>
+        <w:rPr>
+          <w:rFonts w:ascii="Helvetica Light" w:hAnsi="Helvetica Light" w:cs="Helvetica Light"/>
+          <w:sz w:val="18"/>
+          <w:szCs w:val="18"/>
+        </w:rPr>
+        <w:t>| Shared storefront frame | Header, navigation, announcement-bar and footer treatment. |</w:t>
+      </w:r>
+    </w:p>
+    <w:p>
+      <w:pPr/>
+      <w:r>
+        <w:rPr>
+          <w:rFonts w:ascii="Helvetica Light" w:hAnsi="Helvetica Light" w:cs="Helvetica Light"/>
+          <w:sz w:val="18"/>
+          <w:szCs w:val="18"/>
+        </w:rPr>
+        <w:t>| Homepage | Hero composition; section hierarchy/order; product or collection presentation; story/campaign composition; rhythm and density. |</w:t>
+      </w:r>
+    </w:p>
+    <w:p>
+      <w:pPr/>
+      <w:r>
+        <w:rPr>
+          <w:rFonts w:ascii="Helvetica Light" w:hAnsi="Helvetica Light" w:cs="Helvetica Light"/>
+          <w:sz w:val="18"/>
+          <w:szCs w:val="18"/>
+        </w:rPr>
+        <w:t>| Collection | Header treatment; filtering/discovery; product-card composition; merchandising density; collection hierarchy. |</w:t>
+      </w:r>
+    </w:p>
+    <w:p>
+      <w:pPr/>
+      <w:r>
+        <w:rPr>
+          <w:rFonts w:ascii="Helvetica Light" w:hAnsi="Helvetica Light" w:cs="Helvetica Light"/>
+          <w:sz w:val="18"/>
+          <w:szCs w:val="18"/>
+        </w:rPr>
+        <w:t>| Product detail | Gallery; product-information hierarchy; options and specifications; purchasing-area hierarchy; related products. |</w:t>
+      </w:r>
+    </w:p>
+    <w:p>
+      <w:pPr/>
+      <w:r>
+        <w:rPr>
+          <w:rFonts w:ascii="Helvetica Light" w:hAnsi="Helvetica Light" w:cs="Helvetica Light"/>
+          <w:sz w:val="18"/>
+          <w:szCs w:val="18"/>
+        </w:rPr>
+        <w:t>| Whole storefront | Coherent typography, surfaces, spacing/density, image treatment and page-to-page direction. |</w:t>
+      </w:r>
+    </w:p>
+    <w:p/>
+    <w:p>
+      <w:pPr/>
+      <w:r>
+        <w:rPr>
+          <w:rFonts w:ascii="Helvetica Light" w:hAnsi="Helvetica Light" w:cs="Helvetica Light"/>
+          <w:sz w:val="18"/>
+          <w:szCs w:val="18"/>
+        </w:rPr>
+        <w:t>Colour, typography, copy, spacing or density alone; one hero; homepage-only change; one changed page;</w:t>
+      </w:r>
+    </w:p>
+    <w:p>
+      <w:pPr/>
+      <w:r>
+        <w:rPr>
+          <w:rFonts w:ascii="Helvetica Light" w:hAnsi="Helvetica Light" w:cs="Helvetica Light"/>
+          <w:sz w:val="18"/>
+          <w:szCs w:val="18"/>
+        </w:rPr>
+        <w:t>unchanged recipes with new tokens; a generic starter theme; unrelated page designs; provider HTTP</w:t>
+      </w:r>
+    </w:p>
+    <w:p>
+      <w:pPr/>
+      <w:r>
+        <w:rPr>
+          <w:rFonts w:ascii="Helvetica Light" w:hAnsi="Helvetica Light" w:cs="Helvetica Light"/>
+          <w:sz w:val="18"/>
+          <w:szCs w:val="18"/>
+        </w:rPr>
+        <w:t>success; or a valid but visually immaterial proposal MUST fail the Phase 9 closing gate.</w:t>
+      </w:r>
+    </w:p>
+    <w:p/>
+    <w:p>
+      <w:pPr/>
+      <w:r>
+        <w:rPr>
+          <w:rFonts w:ascii="Helvetica Light" w:hAnsi="Helvetica Light" w:cs="Helvetica Light"/>
+          <w:sz w:val="18"/>
+          <w:szCs w:val="18"/>
+        </w:rPr>
         <w:t>The binding order inside Phase 9 is:</w:t>
       </w:r>
     </w:p>
@@ -1458,6 +1626,29 @@
           <w:sz w:val="18"/>
           <w:szCs w:val="18"/>
         </w:rPr>
+        <w:t>Protected commerce, history, rollback and explicit publishing are invariants throughout this order;</w:t>
+      </w:r>
+    </w:p>
+    <w:p>
+      <w:pPr/>
+      <w:r>
+        <w:rPr>
+          <w:rFonts w:ascii="Helvetica Light" w:hAnsi="Helvetica Light" w:cs="Helvetica Light"/>
+          <w:sz w:val="18"/>
+          <w:szCs w:val="18"/>
+        </w:rPr>
+        <w:t>they are never deferred while composition is proved.</w:t>
+      </w:r>
+    </w:p>
+    <w:p/>
+    <w:p>
+      <w:pPr/>
+      <w:r>
+        <w:rPr>
+          <w:rFonts w:ascii="Helvetica Light" w:hAnsi="Helvetica Light" w:cs="Helvetica Light"/>
+          <w:sz w:val="18"/>
+          <w:szCs w:val="18"/>
+        </w:rPr>
         <w:t>PR #123 is merged evidence for exact valid token refinement, including preservation semantics. It</w:t>
       </w:r>
     </w:p>
@@ -1525,6 +1716,73 @@
           <w:sz w:val="18"/>
           <w:szCs w:val="18"/>
         </w:rPr>
+        <w:t>The verified PR #123 correction records `spacing: null` for preservation-only spacing, maps</w:t>
+      </w:r>
+    </w:p>
+    <w:p>
+      <w:pPr/>
+      <w:r>
+        <w:rPr>
+          <w:rFonts w:ascii="Helvetica Light" w:hAnsi="Helvetica Light" w:cs="Helvetica Light"/>
+          <w:sz w:val="18"/>
+          <w:szCs w:val="18"/>
+        </w:rPr>
+        <w:t>`#201A17` to primary/text, `#C9A27A` to secondary/accent, `#6B2E3D` to button/strong accent and</w:t>
+      </w:r>
+    </w:p>
+    <w:p>
+      <w:pPr/>
+      <w:r>
+        <w:rPr>
+          <w:rFonts w:ascii="Helvetica Light" w:hAnsi="Helvetica Light" w:cs="Helvetica Light"/>
+          <w:sz w:val="18"/>
+          <w:szCs w:val="18"/>
+        </w:rPr>
+        <w:t>`#E7D8C8` to surface/border, resolves heading/body intent to registered system serif/sans, issues</w:t>
+      </w:r>
+    </w:p>
+    <w:p>
+      <w:pPr/>
+      <w:r>
+        <w:rPr>
+          <w:rFonts w:ascii="Helvetica Light" w:hAnsi="Helvetica Light" w:cs="Helvetica Light"/>
+          <w:sz w:val="18"/>
+          <w:szCs w:val="18"/>
+        </w:rPr>
+        <w:t>one canonical storefront POST, advances local authority once on acceptance and preserves structure,</w:t>
+      </w:r>
+    </w:p>
+    <w:p>
+      <w:pPr/>
+      <w:r>
+        <w:rPr>
+          <w:rFonts w:ascii="Helvetica Light" w:hAnsi="Helvetica Light" w:cs="Helvetica Light"/>
+          <w:sz w:val="18"/>
+          <w:szCs w:val="18"/>
+        </w:rPr>
+        <w:t>navigation, assets, bindings and commerce. Automated coverage uses provider-shaped or mocked</w:t>
+      </w:r>
+    </w:p>
+    <w:p>
+      <w:pPr/>
+      <w:r>
+        <w:rPr>
+          <w:rFonts w:ascii="Helvetica Light" w:hAnsi="Helvetica Light" w:cs="Helvetica Light"/>
+          <w:sz w:val="18"/>
+          <w:szCs w:val="18"/>
+        </w:rPr>
+        <w:t>transport; a live network response is not retained and therefore is not claimed.</w:t>
+      </w:r>
+    </w:p>
+    <w:p/>
+    <w:p>
+      <w:pPr/>
+      <w:r>
+        <w:rPr>
+          <w:rFonts w:ascii="Helvetica Light" w:hAnsi="Helvetica Light" w:cs="Helvetica Light"/>
+          <w:sz w:val="18"/>
+          <w:szCs w:val="18"/>
+        </w:rPr>
         <w:t>### Acceptance ownership correction</w:t>
       </w:r>
     </w:p>
@@ -1862,96 +2120,880 @@
           <w:sz w:val="18"/>
           <w:szCs w:val="18"/>
         </w:rPr>
-        <w:t>P10B follows P10A and delivers asset upload/library workflows, role and provenance review,</w:t>
-      </w:r>
-    </w:p>
-    <w:p>
-      <w:pPr/>
-      <w:r>
-        <w:rPr>
-          <w:rFonts w:ascii="Helvetica Light" w:hAnsi="Helvetica Light" w:cs="Helvetica Light"/>
-          <w:sz w:val="18"/>
-          <w:szCs w:val="18"/>
-        </w:rPr>
-        <w:t>generated-image candidate/approval/promotion/replacement lifecycle, and Storefront Studio UX that</w:t>
-      </w:r>
-    </w:p>
-    <w:p>
-      <w:pPr/>
-      <w:r>
-        <w:rPr>
-          <w:rFonts w:ascii="Helvetica Light" w:hAnsi="Helvetica Light" w:cs="Helvetica Light"/>
-          <w:sz w:val="18"/>
-          <w:szCs w:val="18"/>
-        </w:rPr>
-        <w:t>consumes the P10A contracts. Existing `AssetInventory` roles and provenance are the foundation; do</w:t>
-      </w:r>
-    </w:p>
-    <w:p>
-      <w:pPr/>
-      <w:r>
-        <w:rPr>
-          <w:rFonts w:ascii="Helvetica Light" w:hAnsi="Helvetica Light" w:cs="Helvetica Light"/>
-          <w:sz w:val="18"/>
-          <w:szCs w:val="18"/>
-        </w:rPr>
-        <w:t>not create a competing media system.</w:t>
-      </w:r>
-    </w:p>
-    <w:p/>
-    <w:p>
-      <w:pPr/>
-      <w:r>
-        <w:rPr>
-          <w:rFonts w:ascii="Helvetica Light" w:hAnsi="Helvetica Light" w:cs="Helvetica Light"/>
-          <w:sz w:val="18"/>
-          <w:szCs w:val="18"/>
-        </w:rPr>
-        <w:t>Phase 11 then adds granular merchant editing at selected section, current page, shared frame,</w:t>
-      </w:r>
-    </w:p>
-    <w:p>
-      <w:pPr/>
-      <w:r>
-        <w:rPr>
-          <w:rFonts w:ascii="Helvetica Light" w:hAnsi="Helvetica Light" w:cs="Helvetica Light"/>
-          <w:sz w:val="18"/>
-          <w:szCs w:val="18"/>
-        </w:rPr>
-        <w:t>design system and complete storefront scopes. Phase 12 consolidates stable canonical domains and</w:t>
-      </w:r>
-    </w:p>
-    <w:p>
-      <w:pPr/>
-      <w:r>
-        <w:rPr>
-          <w:rFonts w:ascii="Helvetica Light" w:hAnsi="Helvetica Light" w:cs="Helvetica Light"/>
-          <w:sz w:val="18"/>
-          <w:szCs w:val="18"/>
-        </w:rPr>
-        <w:t>adapter ports and supplies a Vesko reference adapter. Immediate full staging integration is not a</w:t>
-      </w:r>
-    </w:p>
-    <w:p>
-      <w:pPr/>
-      <w:r>
-        <w:rPr>
-          <w:rFonts w:ascii="Helvetica Light" w:hAnsi="Helvetica Light" w:cs="Helvetica Light"/>
-          <w:sz w:val="18"/>
-          <w:szCs w:val="18"/>
-        </w:rPr>
-        <w:t>Phase 12 prerequisite; authentication, tenancy, production operations and rollout remain later</w:t>
-      </w:r>
-    </w:p>
-    <w:p>
-      <w:pPr/>
-      <w:r>
-        <w:rPr>
-          <w:rFonts w:ascii="Helvetica Light" w:hAnsi="Helvetica Light" w:cs="Helvetica Light"/>
-          <w:sz w:val="18"/>
-          <w:szCs w:val="18"/>
-        </w:rPr>
-        <w:t>deployment work.</w:t>
+        <w:t>The P10A-02 audit MUST produce a live gap matrix with columns Capability, Existing source,</w:t>
+      </w:r>
+    </w:p>
+    <w:p>
+      <w:pPr/>
+      <w:r>
+        <w:rPr>
+          <w:rFonts w:ascii="Helvetica Light" w:hAnsi="Helvetica Light" w:cs="Helvetica Light"/>
+          <w:sz w:val="18"/>
+          <w:szCs w:val="18"/>
+        </w:rPr>
+        <w:t>Runtime-queryable, Planner-visible, Compiler-preserved, Validated, Rendered and Missing work. Each</w:t>
+      </w:r>
+    </w:p>
+    <w:p>
+      <w:pPr/>
+      <w:r>
+        <w:rPr>
+          <w:rFonts w:ascii="Helvetica Light" w:hAnsi="Helvetica Light" w:cs="Helvetica Light"/>
+          <w:sz w:val="18"/>
+          <w:szCs w:val="18"/>
+        </w:rPr>
+        <w:t>row is classified existing-and-sufficient, existing-but-not-queryable, duplicated,</w:t>
+      </w:r>
+    </w:p>
+    <w:p>
+      <w:pPr/>
+      <w:r>
+        <w:rPr>
+          <w:rFonts w:ascii="Helvetica Light" w:hAnsi="Helvetica Light" w:cs="Helvetica Light"/>
+          <w:sz w:val="18"/>
+          <w:szCs w:val="18"/>
+        </w:rPr>
+        <w:t>planner-visible-but-lost, render-only or missing. Capability facts found only in prompts, tests,</w:t>
+      </w:r>
+    </w:p>
+    <w:p>
+      <w:pPr/>
+      <w:r>
+        <w:rPr>
+          <w:rFonts w:ascii="Helvetica Light" w:hAnsi="Helvetica Light" w:cs="Helvetica Light"/>
+          <w:sz w:val="18"/>
+          <w:szCs w:val="18"/>
+        </w:rPr>
+        <w:t>fixtures or allowlists must be identified before P10A-03 design.</w:t>
+      </w:r>
+    </w:p>
+    <w:p/>
+    <w:p>
+      <w:pPr/>
+      <w:r>
+        <w:rPr>
+          <w:rFonts w:ascii="Helvetica Light" w:hAnsi="Helvetica Light" w:cs="Helvetica Light"/>
+          <w:sz w:val="18"/>
+          <w:szCs w:val="18"/>
+        </w:rPr>
+        <w:t>P10A-03 is generated from `ComponentDefinitionV2`, PageBlueprint/template contracts,</w:t>
+      </w:r>
+    </w:p>
+    <w:p>
+      <w:pPr/>
+      <w:r>
+        <w:rPr>
+          <w:rFonts w:ascii="Helvetica Light" w:hAnsi="Helvetica Light" w:cs="Helvetica Light"/>
+          <w:sz w:val="18"/>
+          <w:szCs w:val="18"/>
+        </w:rPr>
+        <w:t>`DataBinding`, asset and adapter capability contracts, protected paths and migration metadata. For</w:t>
+      </w:r>
+    </w:p>
+    <w:p>
+      <w:pPr/>
+      <w:r>
+        <w:rPr>
+          <w:rFonts w:ascii="Helvetica Light" w:hAnsi="Helvetica Light" w:cs="Helvetica Light"/>
+          <w:sz w:val="18"/>
+          <w:szCs w:val="18"/>
+        </w:rPr>
+        <w:t>each applicable component it exposes type, version, family, variants, page types, slots and</w:t>
+      </w:r>
+    </w:p>
+    <w:p>
+      <w:pPr/>
+      <w:r>
+        <w:rPr>
+          <w:rFonts w:ascii="Helvetica Light" w:hAnsi="Helvetica Light" w:cs="Helvetica Light"/>
+          <w:sz w:val="18"/>
+          <w:szCs w:val="18"/>
+        </w:rPr>
+        <w:t>cardinality, props/content schemas, binding requirements, editable/protected paths,</w:t>
+      </w:r>
+    </w:p>
+    <w:p>
+      <w:pPr/>
+      <w:r>
+        <w:rPr>
+          <w:rFonts w:ascii="Helvetica Light" w:hAnsi="Helvetica Light" w:cs="Helvetica Light"/>
+          <w:sz w:val="18"/>
+          <w:szCs w:val="18"/>
+        </w:rPr>
+        <w:t>responsive/accessibility rules, asset requirements, compatibility and migration version. Codex and</w:t>
+      </w:r>
+    </w:p>
+    <w:p>
+      <w:pPr/>
+      <w:r>
+        <w:rPr>
+          <w:rFonts w:ascii="Helvetica Light" w:hAnsi="Helvetica Light" w:cs="Helvetica Light"/>
+          <w:sz w:val="18"/>
+          <w:szCs w:val="18"/>
+        </w:rPr>
+        <w:t>the live design agent query the same source. Unknown or stale capability references fail before</w:t>
+      </w:r>
+    </w:p>
+    <w:p>
+      <w:pPr/>
+      <w:r>
+        <w:rPr>
+          <w:rFonts w:ascii="Helvetica Light" w:hAnsi="Helvetica Light" w:cs="Helvetica Light"/>
+          <w:sz w:val="18"/>
+          <w:szCs w:val="18"/>
+        </w:rPr>
+        <w:t>preview.</w:t>
+      </w:r>
+    </w:p>
+    <w:p/>
+    <w:p>
+      <w:pPr/>
+      <w:r>
+        <w:rPr>
+          <w:rFonts w:ascii="Helvetica Light" w:hAnsi="Helvetica Light" w:cs="Helvetica Light"/>
+          <w:sz w:val="18"/>
+          <w:szCs w:val="18"/>
+        </w:rPr>
+        <w:t>P10A-04 PageBlueprint metadata includes ID/version/page type, required and optional families,</w:t>
+      </w:r>
+    </w:p>
+    <w:p>
+      <w:pPr/>
+      <w:r>
+        <w:rPr>
+          <w:rFonts w:ascii="Helvetica Light" w:hAnsi="Helvetica Light" w:cs="Helvetica Light"/>
+          <w:sz w:val="18"/>
+          <w:szCs w:val="18"/>
+        </w:rPr>
+        <w:t>cardinality and order, binding and asset-role requirements, responsive composition and</w:t>
+      </w:r>
+    </w:p>
+    <w:p>
+      <w:pPr/>
+      <w:r>
+        <w:rPr>
+          <w:rFonts w:ascii="Helvetica Light" w:hAnsi="Helvetica Light" w:cs="Helvetica Light"/>
+          <w:sz w:val="18"/>
+          <w:szCs w:val="18"/>
+        </w:rPr>
+        <w:t>compatibility. A blueprint is an independent generation starting point; generated output becomes</w:t>
+      </w:r>
+    </w:p>
+    <w:p>
+      <w:pPr/>
+      <w:r>
+        <w:rPr>
+          <w:rFonts w:ascii="Helvetica Light" w:hAnsi="Helvetica Light" w:cs="Helvetica Light"/>
+          <w:sz w:val="18"/>
+          <w:szCs w:val="18"/>
+        </w:rPr>
+        <w:t>ordinary snapshot state and is not silently rewritten when the blueprint later changes. Dynamic</w:t>
+      </w:r>
+    </w:p>
+    <w:p>
+      <w:pPr/>
+      <w:r>
+        <w:rPr>
+          <w:rFonts w:ascii="Helvetica Light" w:hAnsi="Helvetica Light" w:cs="Helvetica Light"/>
+          <w:sz w:val="18"/>
+          <w:szCs w:val="18"/>
+        </w:rPr>
+        <w:t>PDP and collection composition stays stable while runtime bindings resolve different entities.</w:t>
+      </w:r>
+    </w:p>
+    <w:p/>
+    <w:p>
+      <w:pPr/>
+      <w:r>
+        <w:rPr>
+          <w:rFonts w:ascii="Helvetica Light" w:hAnsi="Helvetica Light" w:cs="Helvetica Light"/>
+          <w:sz w:val="18"/>
+          <w:szCs w:val="18"/>
+        </w:rPr>
+        <w:t>P10A-05 targets versioned Skill packages for storefront orchestration, initial generation,</w:t>
+      </w:r>
+    </w:p>
+    <w:p>
+      <w:pPr/>
+      <w:r>
+        <w:rPr>
+          <w:rFonts w:ascii="Helvetica Light" w:hAnsi="Helvetica Light" w:cs="Helvetica Light"/>
+          <w:sz w:val="18"/>
+          <w:szCs w:val="18"/>
+        </w:rPr>
+        <w:t>selected-section editing, shared-frame editing, current-page editing, page/whole-storefront</w:t>
+      </w:r>
+    </w:p>
+    <w:p>
+      <w:pPr/>
+      <w:r>
+        <w:rPr>
+          <w:rFonts w:ascii="Helvetica Light" w:hAnsi="Helvetica Light" w:cs="Helvetica Light"/>
+          <w:sz w:val="18"/>
+          <w:szCs w:val="18"/>
+        </w:rPr>
+        <w:t>regeneration, brand tokens, homepage, collection, dynamic PDP, assets, image generation,</w:t>
+      </w:r>
+    </w:p>
+    <w:p>
+      <w:pPr/>
+      <w:r>
+        <w:rPr>
+          <w:rFonts w:ascii="Helvetica Light" w:hAnsi="Helvetica Light" w:cs="Helvetica Light"/>
+          <w:sz w:val="18"/>
+          <w:szCs w:val="18"/>
+        </w:rPr>
+        <w:t>localization and validation/publish. Each package defines its instructions, required capability</w:t>
+      </w:r>
+    </w:p>
+    <w:p>
+      <w:pPr/>
+      <w:r>
+        <w:rPr>
+          <w:rFonts w:ascii="Helvetica Light" w:hAnsi="Helvetica Light" w:cs="Helvetica Light"/>
+          <w:sz w:val="18"/>
+          <w:szCs w:val="18"/>
+        </w:rPr>
+        <w:t>queries, allowed operations, exact input/output schemas, examples, deterministic fixtures, negative</w:t>
+      </w:r>
+    </w:p>
+    <w:p>
+      <w:pPr/>
+      <w:r>
+        <w:rPr>
+          <w:rFonts w:ascii="Helvetica Light" w:hAnsi="Helvetica Light" w:cs="Helvetica Light"/>
+          <w:sz w:val="18"/>
+          <w:szCs w:val="18"/>
+        </w:rPr>
+        <w:t>and validation cases and permission scope. A whole-store generation Skill is never reused for one</w:t>
+      </w:r>
+    </w:p>
+    <w:p>
+      <w:pPr/>
+      <w:r>
+        <w:rPr>
+          <w:rFonts w:ascii="Helvetica Light" w:hAnsi="Helvetica Light" w:cs="Helvetica Light"/>
+          <w:sz w:val="18"/>
+          <w:szCs w:val="18"/>
+        </w:rPr>
+        <w:t>hero or page.</w:t>
+      </w:r>
+    </w:p>
+    <w:p/>
+    <w:p>
+      <w:pPr/>
+      <w:r>
+        <w:rPr>
+          <w:rFonts w:ascii="Helvetica Light" w:hAnsi="Helvetica Light" w:cs="Helvetica Light"/>
+          <w:sz w:val="18"/>
+          <w:szCs w:val="18"/>
+        </w:rPr>
+        <w:t>P10A-06 uses the canonical scopes selected section/component, current page, shared storefront frame,</w:t>
+      </w:r>
+    </w:p>
+    <w:p>
+      <w:pPr/>
+      <w:r>
+        <w:rPr>
+          <w:rFonts w:ascii="Helvetica Light" w:hAnsi="Helvetica Light" w:cs="Helvetica Light"/>
+          <w:sz w:val="18"/>
+          <w:szCs w:val="18"/>
+        </w:rPr>
+        <w:t>design system and complete storefront. “Shared storefront frame” means navigation, header,</w:t>
+      </w:r>
+    </w:p>
+    <w:p>
+      <w:pPr/>
+      <w:r>
+        <w:rPr>
+          <w:rFonts w:ascii="Helvetica Light" w:hAnsi="Helvetica Light" w:cs="Helvetica Light"/>
+          <w:sz w:val="18"/>
+          <w:szCs w:val="18"/>
+        </w:rPr>
+        <w:t>announcement bar and footer. The router explains unavailable capabilities, offers valid</w:t>
+      </w:r>
+    </w:p>
+    <w:p>
+      <w:pPr/>
+      <w:r>
+        <w:rPr>
+          <w:rFonts w:ascii="Helvetica Light" w:hAnsi="Helvetica Light" w:cs="Helvetica Light"/>
+          <w:sz w:val="18"/>
+          <w:szCs w:val="18"/>
+        </w:rPr>
+        <w:t>alternatives and obtains approval before widening; “change this hero” cannot regenerate the site,</w:t>
+      </w:r>
+    </w:p>
+    <w:p>
+      <w:pPr/>
+      <w:r>
+        <w:rPr>
+          <w:rFonts w:ascii="Helvetica Light" w:hAnsi="Helvetica Light" w:cs="Helvetica Light"/>
+          <w:sz w:val="18"/>
+          <w:szCs w:val="18"/>
+        </w:rPr>
+        <w:t>“make this PDP technical” cannot modify home, “navigation and footer” may target the shared frame</w:t>
+      </w:r>
+    </w:p>
+    <w:p>
+      <w:pPr/>
+      <w:r>
+        <w:rPr>
+          <w:rFonts w:ascii="Helvetica Light" w:hAnsi="Helvetica Light" w:cs="Helvetica Light"/>
+          <w:sz w:val="18"/>
+          <w:szCs w:val="18"/>
+        </w:rPr>
+        <w:t>and “use this palette everywhere” may target the design system.</w:t>
+      </w:r>
+    </w:p>
+    <w:p/>
+    <w:p>
+      <w:pPr/>
+      <w:r>
+        <w:rPr>
+          <w:rFonts w:ascii="Helvetica Light" w:hAnsi="Helvetica Light" w:cs="Helvetica Light"/>
+          <w:sz w:val="18"/>
+          <w:szCs w:val="18"/>
+        </w:rPr>
+        <w:t>P10A-07 golden stores include premium/minimal jewellery, editorial jewellery, a watch retailer, a</w:t>
+      </w:r>
+    </w:p>
+    <w:p>
+      <w:pPr/>
+      <w:r>
+        <w:rPr>
+          <w:rFonts w:ascii="Helvetica Light" w:hAnsi="Helvetica Light" w:cs="Helvetica Light"/>
+          <w:sz w:val="18"/>
+          <w:szCs w:val="18"/>
+        </w:rPr>
+        <w:t>dense hardware/general-retail catalogue, EN/FI, a simple watch PDP and a complex configurable ring</w:t>
+      </w:r>
+    </w:p>
+    <w:p>
+      <w:pPr/>
+      <w:r>
+        <w:rPr>
+          <w:rFonts w:ascii="Helvetica Light" w:hAnsi="Helvetica Light" w:cs="Helvetica Light"/>
+          <w:sz w:val="18"/>
+          <w:szCs w:val="18"/>
+        </w:rPr>
+        <w:t>PDP. The non-jewellery fixture is mandatory to detect luxury, jewellery, Karvonen and sparse-catalog</w:t>
+      </w:r>
+    </w:p>
+    <w:p>
+      <w:pPr/>
+      <w:r>
+        <w:rPr>
+          <w:rFonts w:ascii="Helvetica Light" w:hAnsi="Helvetica Light" w:cs="Helvetica Light"/>
+          <w:sz w:val="18"/>
+          <w:szCs w:val="18"/>
+        </w:rPr>
+        <w:t>assumptions. Gates cover schemas, registered capabilities, bindings/commerce, responsive behavior,</w:t>
+      </w:r>
+    </w:p>
+    <w:p>
+      <w:pPr/>
+      <w:r>
+        <w:rPr>
+          <w:rFonts w:ascii="Helvetica Light" w:hAnsi="Helvetica Light" w:cs="Helvetica Light"/>
+          <w:sz w:val="18"/>
+          <w:szCs w:val="18"/>
+        </w:rPr>
+        <w:t>accessibility, brand/page coherence, diversity, fixture leakage, asset provenance, performance and</w:t>
+      </w:r>
+    </w:p>
+    <w:p>
+      <w:pPr/>
+      <w:r>
+        <w:rPr>
+          <w:rFonts w:ascii="Helvetica Light" w:hAnsi="Helvetica Light" w:cs="Helvetica Light"/>
+          <w:sz w:val="18"/>
+          <w:szCs w:val="18"/>
+        </w:rPr>
+        <w:t>exact atomic Undo/Redo.</w:t>
+      </w:r>
+    </w:p>
+    <w:p/>
+    <w:p>
+      <w:pPr/>
+      <w:r>
+        <w:rPr>
+          <w:rFonts w:ascii="Helvetica Light" w:hAnsi="Helvetica Light" w:cs="Helvetica Light"/>
+          <w:sz w:val="18"/>
+          <w:szCs w:val="18"/>
+        </w:rPr>
+        <w:t>P10A-08 compiles validated draft `StorefrontSnapshot` → publish-time validation → immutable runtime</w:t>
+      </w:r>
+    </w:p>
+    <w:p>
+      <w:pPr/>
+      <w:r>
+        <w:rPr>
+          <w:rFonts w:ascii="Helvetica Light" w:hAnsi="Helvetica Light" w:cs="Helvetica Light"/>
+          <w:sz w:val="18"/>
+          <w:szCs w:val="18"/>
+        </w:rPr>
+        <w:t>snapshot → published renderer. It rejects invalid bindings, unknown component versions, missing</w:t>
+      </w:r>
+    </w:p>
+    <w:p>
+      <w:pPr/>
+      <w:r>
+        <w:rPr>
+          <w:rFonts w:ascii="Helvetica Light" w:hAnsi="Helvetica Light" w:cs="Helvetica Light"/>
+          <w:sz w:val="18"/>
+          <w:szCs w:val="18"/>
+        </w:rPr>
+        <w:t>required fields or critical assets, protected-field violations, critical accessibility failures</w:t>
+      </w:r>
+    </w:p>
+    <w:p>
+      <w:pPr/>
+      <w:r>
+        <w:rPr>
+          <w:rFonts w:ascii="Helvetica Light" w:hAnsi="Helvetica Light" w:cs="Helvetica Light"/>
+          <w:sz w:val="18"/>
+          <w:szCs w:val="18"/>
+        </w:rPr>
+        <w:t>and unresolved migrations. Published storefronts require no LLM, Puck runtime, provider proposal</w:t>
+      </w:r>
+    </w:p>
+    <w:p>
+      <w:pPr/>
+      <w:r>
+        <w:rPr>
+          <w:rFonts w:ascii="Helvetica Light" w:hAnsi="Helvetica Light" w:cs="Helvetica Light"/>
+          <w:sz w:val="18"/>
+          <w:szCs w:val="18"/>
+        </w:rPr>
+        <w:t>object or browser-accessible Vesko/provider credentials. Cart, checkout, order, inventory and</w:t>
+      </w:r>
+    </w:p>
+    <w:p>
+      <w:pPr/>
+      <w:r>
+        <w:rPr>
+          <w:rFonts w:ascii="Helvetica Light" w:hAnsi="Helvetica Light" w:cs="Helvetica Light"/>
+          <w:sz w:val="18"/>
+          <w:szCs w:val="18"/>
+        </w:rPr>
+        <w:t>pricing mutation remain separate commerce operations.</w:t>
+      </w:r>
+    </w:p>
+    <w:p/>
+    <w:p>
+      <w:pPr/>
+      <w:r>
+        <w:rPr>
+          <w:rFonts w:ascii="Helvetica Light" w:hAnsi="Helvetica Light" w:cs="Helvetica Light"/>
+          <w:sz w:val="18"/>
+          <w:szCs w:val="18"/>
+        </w:rPr>
+        <w:t>### P10B asset governance and Storefront Studio</w:t>
+      </w:r>
+    </w:p>
+    <w:p/>
+    <w:p>
+      <w:pPr/>
+      <w:r>
+        <w:rPr>
+          <w:rFonts w:ascii="Helvetica Light" w:hAnsi="Helvetica Light" w:cs="Helvetica Light"/>
+          <w:sz w:val="18"/>
+          <w:szCs w:val="18"/>
+        </w:rPr>
+        <w:t>P10B follows P10A and consumes its capability/scope contracts:</w:t>
+      </w:r>
+    </w:p>
+    <w:p/>
+    <w:p>
+      <w:pPr/>
+      <w:r>
+        <w:rPr>
+          <w:rFonts w:ascii="Helvetica Light" w:hAnsi="Helvetica Light" w:cs="Helvetica Light"/>
+          <w:sz w:val="18"/>
+          <w:szCs w:val="18"/>
+        </w:rPr>
+        <w:t>- **P10B-01 — Brand asset upload/library:** primary/alternate/light/dark logos, favicons, brand,</w:t>
+      </w:r>
+    </w:p>
+    <w:p>
+      <w:pPr/>
+      <w:r>
+        <w:rPr>
+          <w:rFonts w:ascii="Helvetica Light" w:hAnsi="Helvetica Light" w:cs="Helvetica Light"/>
+          <w:sz w:val="18"/>
+          <w:szCs w:val="18"/>
+        </w:rPr>
+        <w:t xml:space="preserve">  campaign, editorial and story imagery, marks/icons, approved illustrations, textures, permitted</w:t>
+      </w:r>
+    </w:p>
+    <w:p>
+      <w:pPr/>
+      <w:r>
+        <w:rPr>
+          <w:rFonts w:ascii="Helvetica Light" w:hAnsi="Helvetica Light" w:cs="Helvetica Light"/>
+          <w:sz w:val="18"/>
+          <w:szCs w:val="18"/>
+        </w:rPr>
+        <w:t xml:space="preserve">  fonts and supported video. Fixture/developer registration is not the merchant workflow.</w:t>
+      </w:r>
+    </w:p>
+    <w:p>
+      <w:pPr/>
+      <w:r>
+        <w:rPr>
+          <w:rFonts w:ascii="Helvetica Light" w:hAnsi="Helvetica Light" w:cs="Helvetica Light"/>
+          <w:sz w:val="18"/>
+          <w:szCs w:val="18"/>
+        </w:rPr>
+        <w:t>- **P10B-02 — Roles/provenance/metadata:** stable ID/domain, provenance, approval, role, dimensions,</w:t>
+      </w:r>
+    </w:p>
+    <w:p>
+      <w:pPr/>
+      <w:r>
+        <w:rPr>
+          <w:rFonts w:ascii="Helvetica Light" w:hAnsi="Helvetica Light" w:cs="Helvetica Light"/>
+          <w:sz w:val="18"/>
+          <w:szCs w:val="18"/>
+        </w:rPr>
+        <w:t xml:space="preserve">  focal point, crop constraints, alt text, locale/market, light/dark suitability, usage restrictions</w:t>
+      </w:r>
+    </w:p>
+    <w:p>
+      <w:pPr/>
+      <w:r>
+        <w:rPr>
+          <w:rFonts w:ascii="Helvetica Light" w:hAnsi="Helvetica Light" w:cs="Helvetica Light"/>
+          <w:sz w:val="18"/>
+          <w:szCs w:val="18"/>
+        </w:rPr>
+        <w:t xml:space="preserve">  and uploaded/generated origin. Canonical product/variant media, merchant brand, campaign,</w:t>
+      </w:r>
+    </w:p>
+    <w:p>
+      <w:pPr/>
+      <w:r>
+        <w:rPr>
+          <w:rFonts w:ascii="Helvetica Light" w:hAnsi="Helvetica Light" w:cs="Helvetica Light"/>
+          <w:sz w:val="18"/>
+          <w:szCs w:val="18"/>
+        </w:rPr>
+        <w:t xml:space="preserve">  editorial, temporary generated and accepted generated assets remain distinct.</w:t>
+      </w:r>
+    </w:p>
+    <w:p>
+      <w:pPr/>
+      <w:r>
+        <w:rPr>
+          <w:rFonts w:ascii="Helvetica Light" w:hAnsi="Helvetica Light" w:cs="Helvetica Light"/>
+          <w:sz w:val="18"/>
+          <w:szCs w:val="18"/>
+        </w:rPr>
+        <w:t>- **P10B-03 — Generated-image lifecycle:** merchant request → capability/policy check → temporary</w:t>
+      </w:r>
+    </w:p>
+    <w:p>
+      <w:pPr/>
+      <w:r>
+        <w:rPr>
+          <w:rFonts w:ascii="Helvetica Light" w:hAnsi="Helvetica Light" w:cs="Helvetica Light"/>
+          <w:sz w:val="18"/>
+          <w:szCs w:val="18"/>
+        </w:rPr>
+        <w:t xml:space="preserve">  proposal asset → technical/safety validation → merchant review → accept/reject → promotion to the</w:t>
+      </w:r>
+    </w:p>
+    <w:p>
+      <w:pPr/>
+      <w:r>
+        <w:rPr>
+          <w:rFonts w:ascii="Helvetica Light" w:hAnsi="Helvetica Light" w:cs="Helvetica Light"/>
+          <w:sz w:val="18"/>
+          <w:szCs w:val="18"/>
+        </w:rPr>
+        <w:t xml:space="preserve">  approved library → snapshot binding to a stable ID. Generated imagery may support hero,</w:t>
+      </w:r>
+    </w:p>
+    <w:p>
+      <w:pPr/>
+      <w:r>
+        <w:rPr>
+          <w:rFonts w:ascii="Helvetica Light" w:hAnsi="Helvetica Light" w:cs="Helvetica Light"/>
+          <w:sz w:val="18"/>
+          <w:szCs w:val="18"/>
+        </w:rPr>
+        <w:t xml:space="preserve">  campaign, lifestyle/editorial, decorative background or abstract brand use but never silently</w:t>
+      </w:r>
+    </w:p>
+    <w:p>
+      <w:pPr/>
+      <w:r>
+        <w:rPr>
+          <w:rFonts w:ascii="Helvetica Light" w:hAnsi="Helvetica Light" w:cs="Helvetica Light"/>
+          <w:sz w:val="18"/>
+          <w:szCs w:val="18"/>
+        </w:rPr>
+        <w:t xml:space="preserve">  replace canonical product/variant media.</w:t>
+      </w:r>
+    </w:p>
+    <w:p>
+      <w:pPr/>
+      <w:r>
+        <w:rPr>
+          <w:rFonts w:ascii="Helvetica Light" w:hAnsi="Helvetica Light" w:cs="Helvetica Light"/>
+          <w:sz w:val="18"/>
+          <w:szCs w:val="18"/>
+        </w:rPr>
+        <w:t>- **P10B-04 — Studio shell:** native Vesko shell, dominant canvas, compact page/section outline,</w:t>
+      </w:r>
+    </w:p>
+    <w:p>
+      <w:pPr/>
+      <w:r>
+        <w:rPr>
+          <w:rFonts w:ascii="Helvetica Light" w:hAnsi="Helvetica Light" w:cs="Helvetica Light"/>
+          <w:sz w:val="18"/>
+          <w:szCs w:val="18"/>
+        </w:rPr>
+        <w:t xml:space="preserve">  Design and AI tabs, merchant language, proposal review, preview, draft, publish, history,</w:t>
+      </w:r>
+    </w:p>
+    <w:p>
+      <w:pPr/>
+      <w:r>
+        <w:rPr>
+          <w:rFonts w:ascii="Helvetica Light" w:hAnsi="Helvetica Light" w:cs="Helvetica Light"/>
+          <w:sz w:val="18"/>
+          <w:szCs w:val="18"/>
+        </w:rPr>
+        <w:t xml:space="preserve">  responsive drawers/bottom sheets and keyboard/accessibility. A polished shell must not conceal an</w:t>
+      </w:r>
+    </w:p>
+    <w:p>
+      <w:pPr/>
+      <w:r>
+        <w:rPr>
+          <w:rFonts w:ascii="Helvetica Light" w:hAnsi="Helvetica Light" w:cs="Helvetica Light"/>
+          <w:sz w:val="18"/>
+          <w:szCs w:val="18"/>
+        </w:rPr>
+        <w:t xml:space="preserve">  ungrounded generator.</w:t>
+      </w:r>
+    </w:p>
+    <w:p/>
+    <w:p>
+      <w:pPr/>
+      <w:r>
+        <w:rPr>
+          <w:rFonts w:ascii="Helvetica Light" w:hAnsi="Helvetica Light" w:cs="Helvetica Light"/>
+          <w:sz w:val="18"/>
+          <w:szCs w:val="18"/>
+        </w:rPr>
+        <w:t>Existing `AssetInventory` roles/provenance are the foundation; do not create a competing media</w:t>
+      </w:r>
+    </w:p>
+    <w:p>
+      <w:pPr/>
+      <w:r>
+        <w:rPr>
+          <w:rFonts w:ascii="Helvetica Light" w:hAnsi="Helvetica Light" w:cs="Helvetica Light"/>
+          <w:sz w:val="18"/>
+          <w:szCs w:val="18"/>
+        </w:rPr>
+        <w:t>system.</w:t>
+      </w:r>
+    </w:p>
+    <w:p/>
+    <w:p>
+      <w:pPr/>
+      <w:r>
+        <w:rPr>
+          <w:rFonts w:ascii="Helvetica Light" w:hAnsi="Helvetica Light" w:cs="Helvetica Light"/>
+          <w:sz w:val="18"/>
+          <w:szCs w:val="18"/>
+        </w:rPr>
+        <w:t>### Phase 11 granular editing</w:t>
+      </w:r>
+    </w:p>
+    <w:p/>
+    <w:p>
+      <w:pPr/>
+      <w:r>
+        <w:rPr>
+          <w:rFonts w:ascii="Helvetica Light" w:hAnsi="Helvetica Light" w:cs="Helvetica Light"/>
+          <w:sz w:val="18"/>
+          <w:szCs w:val="18"/>
+        </w:rPr>
+        <w:t>Phase 11 provides stable section identity and explicit selected section/component, current page,</w:t>
+      </w:r>
+    </w:p>
+    <w:p>
+      <w:pPr/>
+      <w:r>
+        <w:rPr>
+          <w:rFonts w:ascii="Helvetica Light" w:hAnsi="Helvetica Light" w:cs="Helvetica Light"/>
+          <w:sz w:val="18"/>
+          <w:szCs w:val="18"/>
+        </w:rPr>
+        <w:t>shared storefront frame, design system and complete storefront edits. It covers add/remove,</w:t>
+      </w:r>
+    </w:p>
+    <w:p>
+      <w:pPr/>
+      <w:r>
+        <w:rPr>
+          <w:rFonts w:ascii="Helvetica Light" w:hAnsi="Helvetica Light" w:cs="Helvetica Light"/>
+          <w:sz w:val="18"/>
+          <w:szCs w:val="18"/>
+        </w:rPr>
+        <w:t>supported duplication, variant replacement, reorder, page regeneration, mixed-scope atomic history,</w:t>
+      </w:r>
+    </w:p>
+    <w:p>
+      <w:pPr/>
+      <w:r>
+        <w:rPr>
+          <w:rFonts w:ascii="Helvetica Light" w:hAnsi="Helvetica Light" w:cs="Helvetica Light"/>
+          <w:sz w:val="18"/>
+          <w:szCs w:val="18"/>
+        </w:rPr>
+        <w:t>local coherence and strict no-widening. Common targets include header/navigation/announcement,</w:t>
+      </w:r>
+    </w:p>
+    <w:p>
+      <w:pPr/>
+      <w:r>
+        <w:rPr>
+          <w:rFonts w:ascii="Helvetica Light" w:hAnsi="Helvetica Light" w:cs="Helvetica Light"/>
+          <w:sz w:val="18"/>
+          <w:szCs w:val="18"/>
+        </w:rPr>
+        <w:t>hero, featured collections/products, brand story, campaign/trust, collection discovery/grid, PDP</w:t>
+      </w:r>
+    </w:p>
+    <w:p>
+      <w:pPr/>
+      <w:r>
+        <w:rPr>
+          <w:rFonts w:ascii="Helvetica Light" w:hAnsi="Helvetica Light" w:cs="Helvetica Light"/>
+          <w:sz w:val="18"/>
+          <w:szCs w:val="18"/>
+        </w:rPr>
+        <w:t>gallery/information/options/specifications and footer.</w:t>
+      </w:r>
+    </w:p>
+    <w:p/>
+    <w:p>
+      <w:pPr/>
+      <w:r>
+        <w:rPr>
+          <w:rFonts w:ascii="Helvetica Light" w:hAnsi="Helvetica Light" w:cs="Helvetica Light"/>
+          <w:sz w:val="18"/>
+          <w:szCs w:val="18"/>
+        </w:rPr>
+        <w:t>### Phase 12 canonical domains and adapters</w:t>
+      </w:r>
+    </w:p>
+    <w:p/>
+    <w:p>
+      <w:pPr/>
+      <w:r>
+        <w:rPr>
+          <w:rFonts w:ascii="Helvetica Light" w:hAnsi="Helvetica Light" w:cs="Helvetica Light"/>
+          <w:sz w:val="18"/>
+          <w:szCs w:val="18"/>
+        </w:rPr>
+        <w:t>Phase 12 consolidates canonical product, variant/option, collection/navigation,</w:t>
+      </w:r>
+    </w:p>
+    <w:p>
+      <w:pPr/>
+      <w:r>
+        <w:rPr>
+          <w:rFonts w:ascii="Helvetica Light" w:hAnsi="Helvetica Light" w:cs="Helvetica Light"/>
+          <w:sz w:val="18"/>
+          <w:szCs w:val="18"/>
+        </w:rPr>
+        <w:t>price/availability-presentation, localization, product-media, brand-asset and generated-asset</w:t>
+      </w:r>
+    </w:p>
+    <w:p>
+      <w:pPr/>
+      <w:r>
+        <w:rPr>
+          <w:rFonts w:ascii="Helvetica Light" w:hAnsi="Helvetica Light" w:cs="Helvetica Light"/>
+          <w:sz w:val="18"/>
+          <w:szCs w:val="18"/>
+        </w:rPr>
+        <w:t>domains. Versioned image-delivery, commerce, collection/navigation and asset adapters define</w:t>
+      </w:r>
+    </w:p>
+    <w:p>
+      <w:pPr/>
+      <w:r>
+        <w:rPr>
+          <w:rFonts w:ascii="Helvetica Light" w:hAnsi="Helvetica Light" w:cs="Helvetica Light"/>
+          <w:sz w:val="18"/>
+          <w:szCs w:val="18"/>
+        </w:rPr>
+        <w:t>capability negotiation, synchronization semantics, typed errors, versioning, conformance fixtures</w:t>
+      </w:r>
+    </w:p>
+    <w:p>
+      <w:pPr/>
+      <w:r>
+        <w:rPr>
+          <w:rFonts w:ascii="Helvetica Light" w:hAnsi="Helvetica Light" w:cs="Helvetica Light"/>
+          <w:sz w:val="18"/>
+          <w:szCs w:val="18"/>
+        </w:rPr>
+        <w:t>and integration documentation. Vesko is the first reference implementation of these canonical</w:t>
+      </w:r>
+    </w:p>
+    <w:p>
+      <w:pPr/>
+      <w:r>
+        <w:rPr>
+          <w:rFonts w:ascii="Helvetica Light" w:hAnsi="Helvetica Light" w:cs="Helvetica Light"/>
+          <w:sz w:val="18"/>
+          <w:szCs w:val="18"/>
+        </w:rPr>
+        <w:t>contracts, not a special case embedded through the editor.</w:t>
+      </w:r>
+    </w:p>
+    <w:p/>
+    <w:p>
+      <w:pPr/>
+      <w:r>
+        <w:rPr>
+          <w:rFonts w:ascii="Helvetica Light" w:hAnsi="Helvetica Light" w:cs="Helvetica Light"/>
+          <w:sz w:val="18"/>
+          <w:szCs w:val="18"/>
+        </w:rPr>
+        <w:t>Immediate full staging integration is not a Phase 12 prerequisite. Authentication, authorization,</w:t>
+      </w:r>
+    </w:p>
+    <w:p>
+      <w:pPr/>
+      <w:r>
+        <w:rPr>
+          <w:rFonts w:ascii="Helvetica Light" w:hAnsi="Helvetica Light" w:cs="Helvetica Light"/>
+          <w:sz w:val="18"/>
+          <w:szCs w:val="18"/>
+        </w:rPr>
+        <w:t>tenant isolation, production persistence, hosted staging, observability, recovery, pilot operations</w:t>
+      </w:r>
+    </w:p>
+    <w:p>
+      <w:pPr/>
+      <w:r>
+        <w:rPr>
+          <w:rFonts w:ascii="Helvetica Light" w:hAnsi="Helvetica Light" w:cs="Helvetica Light"/>
+          <w:sz w:val="18"/>
+          <w:szCs w:val="18"/>
+        </w:rPr>
+        <w:t>and release remain later deployment work.</w:t>
       </w:r>
     </w:p>
     <w:p/>

</xml_diff>

<commit_message>
docs: clarify P10A and granular editing ownership
</commit_message>
<xml_diff>
--- a/docs/VESKIFY_SDD_v1.2.1.docx
+++ b/docs/VESKIFY_SDD_v1.2.1.docx
@@ -1987,84 +1987,95 @@
           <w:sz w:val="18"/>
           <w:szCs w:val="18"/>
         </w:rPr>
-        <w:t>3. **P10A-03 — Component Knowledge Registry:** generate a queryable view from</w:t>
-      </w:r>
-    </w:p>
-    <w:p>
-      <w:pPr/>
-      <w:r>
-        <w:rPr>
-          <w:rFonts w:ascii="Helvetica Light" w:hAnsi="Helvetica Light" w:cs="Helvetica Light"/>
-          <w:sz w:val="18"/>
-          <w:szCs w:val="18"/>
-        </w:rPr>
-        <w:t xml:space="preserve">   `ComponentDefinitionV2`, renderers, bindings and responsive/accessibility contracts.</w:t>
-      </w:r>
-    </w:p>
-    <w:p>
-      <w:pPr/>
-      <w:r>
-        <w:rPr>
-          <w:rFonts w:ascii="Helvetica Light" w:hAnsi="Helvetica Light" w:cs="Helvetica Light"/>
-          <w:sz w:val="18"/>
-          <w:szCs w:val="18"/>
-        </w:rPr>
-        <w:t>4. **P10A-04 — Executable PageBlueprints:** evolve the current template contracts into validated</w:t>
-      </w:r>
-    </w:p>
-    <w:p>
-      <w:pPr/>
-      <w:r>
-        <w:rPr>
-          <w:rFonts w:ascii="Helvetica Light" w:hAnsi="Helvetica Light" w:cs="Helvetica Light"/>
-          <w:sz w:val="18"/>
-          <w:szCs w:val="18"/>
-        </w:rPr>
-        <w:t xml:space="preserve">   composition rules that compile to `StorefrontSnapshot`.</w:t>
-      </w:r>
-    </w:p>
-    <w:p>
-      <w:pPr/>
-      <w:r>
-        <w:rPr>
-          <w:rFonts w:ascii="Helvetica Light" w:hAnsi="Helvetica Light" w:cs="Helvetica Light"/>
-          <w:sz w:val="18"/>
-          <w:szCs w:val="18"/>
-        </w:rPr>
-        <w:t>5. **P10A-05 — Skill packages:** package instructions, allowed scopes, required capabilities,</w:t>
-      </w:r>
-    </w:p>
-    <w:p>
-      <w:pPr/>
-      <w:r>
-        <w:rPr>
-          <w:rFonts w:ascii="Helvetica Light" w:hAnsi="Helvetica Light" w:cs="Helvetica Light"/>
-          <w:sz w:val="18"/>
-          <w:szCs w:val="18"/>
-        </w:rPr>
-        <w:t xml:space="preserve">   operations, validation and evidence for initial generation and follow-up editing separately.</w:t>
-      </w:r>
-    </w:p>
-    <w:p>
-      <w:pPr/>
-      <w:r>
-        <w:rPr>
-          <w:rFonts w:ascii="Helvetica Light" w:hAnsi="Helvetica Light" w:cs="Helvetica Light"/>
-          <w:sz w:val="18"/>
-          <w:szCs w:val="18"/>
-        </w:rPr>
-        <w:t>6. **P10A-06 — Instruction router:** select section, page, shared-frame, design-system or complete</w:t>
-      </w:r>
-    </w:p>
-    <w:p>
-      <w:pPr/>
-      <w:r>
-        <w:rPr>
-          <w:rFonts w:ascii="Helvetica Light" w:hAnsi="Helvetica Light" w:cs="Helvetica Light"/>
-          <w:sz w:val="18"/>
-          <w:szCs w:val="18"/>
-        </w:rPr>
-        <w:t xml:space="preserve">   storefront scope without widening authority.</w:t>
+        <w:t>3. **P10A-03 — Executable PageBlueprint contracts:** evolve the current template contracts into</w:t>
+      </w:r>
+    </w:p>
+    <w:p>
+      <w:pPr/>
+      <w:r>
+        <w:rPr>
+          <w:rFonts w:ascii="Helvetica Light" w:hAnsi="Helvetica Light" w:cs="Helvetica Light"/>
+          <w:sz w:val="18"/>
+          <w:szCs w:val="18"/>
+        </w:rPr>
+        <w:t xml:space="preserve">   validated composition rules that compile to `StorefrontSnapshot`.</w:t>
+      </w:r>
+    </w:p>
+    <w:p>
+      <w:pPr/>
+      <w:r>
+        <w:rPr>
+          <w:rFonts w:ascii="Helvetica Light" w:hAnsi="Helvetica Light" w:cs="Helvetica Light"/>
+          <w:sz w:val="18"/>
+          <w:szCs w:val="18"/>
+        </w:rPr>
+        <w:t>4. **P10A-04 — Generated Component Knowledge Registry:** generate a queryable capability view from</w:t>
+      </w:r>
+    </w:p>
+    <w:p>
+      <w:pPr/>
+      <w:r>
+        <w:rPr>
+          <w:rFonts w:ascii="Helvetica Light" w:hAnsi="Helvetica Light" w:cs="Helvetica Light"/>
+          <w:sz w:val="18"/>
+          <w:szCs w:val="18"/>
+        </w:rPr>
+        <w:t xml:space="preserve">   canonical contracts, including the executable PageBlueprint contracts produced by P10A-03.</w:t>
+      </w:r>
+    </w:p>
+    <w:p>
+      <w:pPr/>
+      <w:r>
+        <w:rPr>
+          <w:rFonts w:ascii="Helvetica Light" w:hAnsi="Helvetica Light" w:cs="Helvetica Light"/>
+          <w:sz w:val="18"/>
+          <w:szCs w:val="18"/>
+        </w:rPr>
+        <w:t>5. **P10A-05 — Separate Skill package contracts:** define instructions, schemas, authorities,</w:t>
+      </w:r>
+    </w:p>
+    <w:p>
+      <w:pPr/>
+      <w:r>
+        <w:rPr>
+          <w:rFonts w:ascii="Helvetica Light" w:hAnsi="Helvetica Light" w:cs="Helvetica Light"/>
+          <w:sz w:val="18"/>
+          <w:szCs w:val="18"/>
+        </w:rPr>
+        <w:t xml:space="preserve">   allowed scopes, capability requirements, operations, validation and evidence for initial</w:t>
+      </w:r>
+    </w:p>
+    <w:p>
+      <w:pPr/>
+      <w:r>
+        <w:rPr>
+          <w:rFonts w:ascii="Helvetica Light" w:hAnsi="Helvetica Light" w:cs="Helvetica Light"/>
+          <w:sz w:val="18"/>
+          <w:szCs w:val="18"/>
+        </w:rPr>
+        <w:t xml:space="preserve">   generation and follow-up editing separately.</w:t>
+      </w:r>
+    </w:p>
+    <w:p>
+      <w:pPr/>
+      <w:r>
+        <w:rPr>
+          <w:rFonts w:ascii="Helvetica Light" w:hAnsi="Helvetica Light" w:cs="Helvetica Light"/>
+          <w:sz w:val="18"/>
+          <w:szCs w:val="18"/>
+        </w:rPr>
+        <w:t>6. **P10A-06 — Scoped instruction-router contracts:** define scope classification, authority</w:t>
+      </w:r>
+    </w:p>
+    <w:p>
+      <w:pPr/>
+      <w:r>
+        <w:rPr>
+          <w:rFonts w:ascii="Helvetica Light" w:hAnsi="Helvetica Light" w:cs="Helvetica Light"/>
+          <w:sz w:val="18"/>
+          <w:szCs w:val="18"/>
+        </w:rPr>
+        <w:t xml:space="preserve">   declarations, routing schemas and validation rules that prohibit silent authority widening.</w:t>
       </w:r>
     </w:p>
     <w:p>
@@ -2164,52 +2175,108 @@
           <w:sz w:val="18"/>
           <w:szCs w:val="18"/>
         </w:rPr>
-        <w:t>fixtures or allowlists must be identified before P10A-03 design.</w:t>
-      </w:r>
-    </w:p>
-    <w:p/>
-    <w:p>
-      <w:pPr/>
-      <w:r>
-        <w:rPr>
-          <w:rFonts w:ascii="Helvetica Light" w:hAnsi="Helvetica Light" w:cs="Helvetica Light"/>
-          <w:sz w:val="18"/>
-          <w:szCs w:val="18"/>
-        </w:rPr>
-        <w:t>P10A-03 is generated from `ComponentDefinitionV2`, PageBlueprint/template contracts,</w:t>
-      </w:r>
-    </w:p>
-    <w:p>
-      <w:pPr/>
-      <w:r>
-        <w:rPr>
-          <w:rFonts w:ascii="Helvetica Light" w:hAnsi="Helvetica Light" w:cs="Helvetica Light"/>
-          <w:sz w:val="18"/>
-          <w:szCs w:val="18"/>
-        </w:rPr>
-        <w:t>`DataBinding`, asset and adapter capability contracts, protected paths and migration metadata. For</w:t>
-      </w:r>
-    </w:p>
-    <w:p>
-      <w:pPr/>
-      <w:r>
-        <w:rPr>
-          <w:rFonts w:ascii="Helvetica Light" w:hAnsi="Helvetica Light" w:cs="Helvetica Light"/>
-          <w:sz w:val="18"/>
-          <w:szCs w:val="18"/>
-        </w:rPr>
-        <w:t>each applicable component it exposes type, version, family, variants, page types, slots and</w:t>
-      </w:r>
-    </w:p>
-    <w:p>
-      <w:pPr/>
-      <w:r>
-        <w:rPr>
-          <w:rFonts w:ascii="Helvetica Light" w:hAnsi="Helvetica Light" w:cs="Helvetica Light"/>
-          <w:sz w:val="18"/>
-          <w:szCs w:val="18"/>
-        </w:rPr>
-        <w:t>cardinality, props/content schemas, binding requirements, editable/protected paths,</w:t>
+        <w:t>fixtures or allowlists must be identified before P10A-03 contract design.</w:t>
+      </w:r>
+    </w:p>
+    <w:p/>
+    <w:p>
+      <w:pPr/>
+      <w:r>
+        <w:rPr>
+          <w:rFonts w:ascii="Helvetica Light" w:hAnsi="Helvetica Light" w:cs="Helvetica Light"/>
+          <w:sz w:val="18"/>
+          <w:szCs w:val="18"/>
+        </w:rPr>
+        <w:t>P10A-03 PageBlueprint metadata includes ID/version/page type, required and optional families,</w:t>
+      </w:r>
+    </w:p>
+    <w:p>
+      <w:pPr/>
+      <w:r>
+        <w:rPr>
+          <w:rFonts w:ascii="Helvetica Light" w:hAnsi="Helvetica Light" w:cs="Helvetica Light"/>
+          <w:sz w:val="18"/>
+          <w:szCs w:val="18"/>
+        </w:rPr>
+        <w:t>cardinality and order, binding and asset-role requirements, responsive composition and</w:t>
+      </w:r>
+    </w:p>
+    <w:p>
+      <w:pPr/>
+      <w:r>
+        <w:rPr>
+          <w:rFonts w:ascii="Helvetica Light" w:hAnsi="Helvetica Light" w:cs="Helvetica Light"/>
+          <w:sz w:val="18"/>
+          <w:szCs w:val="18"/>
+        </w:rPr>
+        <w:t>compatibility. A blueprint is an independent generation starting point; generated output becomes</w:t>
+      </w:r>
+    </w:p>
+    <w:p>
+      <w:pPr/>
+      <w:r>
+        <w:rPr>
+          <w:rFonts w:ascii="Helvetica Light" w:hAnsi="Helvetica Light" w:cs="Helvetica Light"/>
+          <w:sz w:val="18"/>
+          <w:szCs w:val="18"/>
+        </w:rPr>
+        <w:t>ordinary snapshot state and is not silently rewritten when the blueprint later changes. Dynamic</w:t>
+      </w:r>
+    </w:p>
+    <w:p>
+      <w:pPr/>
+      <w:r>
+        <w:rPr>
+          <w:rFonts w:ascii="Helvetica Light" w:hAnsi="Helvetica Light" w:cs="Helvetica Light"/>
+          <w:sz w:val="18"/>
+          <w:szCs w:val="18"/>
+        </w:rPr>
+        <w:t>PDP and collection composition stays stable while runtime bindings resolve different entities.</w:t>
+      </w:r>
+    </w:p>
+    <w:p/>
+    <w:p>
+      <w:pPr/>
+      <w:r>
+        <w:rPr>
+          <w:rFonts w:ascii="Helvetica Light" w:hAnsi="Helvetica Light" w:cs="Helvetica Light"/>
+          <w:sz w:val="18"/>
+          <w:szCs w:val="18"/>
+        </w:rPr>
+        <w:t>P10A-04 is generated from `ComponentDefinitionV2`, the executable PageBlueprint contracts produced</w:t>
+      </w:r>
+    </w:p>
+    <w:p>
+      <w:pPr/>
+      <w:r>
+        <w:rPr>
+          <w:rFonts w:ascii="Helvetica Light" w:hAnsi="Helvetica Light" w:cs="Helvetica Light"/>
+          <w:sz w:val="18"/>
+          <w:szCs w:val="18"/>
+        </w:rPr>
+        <w:t>by P10A-03, `DataBinding`, renderer, asset and adapter capability contracts, protected paths and</w:t>
+      </w:r>
+    </w:p>
+    <w:p>
+      <w:pPr/>
+      <w:r>
+        <w:rPr>
+          <w:rFonts w:ascii="Helvetica Light" w:hAnsi="Helvetica Light" w:cs="Helvetica Light"/>
+          <w:sz w:val="18"/>
+          <w:szCs w:val="18"/>
+        </w:rPr>
+        <w:t>migration metadata. For each applicable component it exposes type, version, family, variants, page</w:t>
+      </w:r>
+    </w:p>
+    <w:p>
+      <w:pPr/>
+      <w:r>
+        <w:rPr>
+          <w:rFonts w:ascii="Helvetica Light" w:hAnsi="Helvetica Light" w:cs="Helvetica Light"/>
+          <w:sz w:val="18"/>
+          <w:szCs w:val="18"/>
+        </w:rPr>
+        <w:t>types, slots and cardinality, props/content schemas, binding requirements, editable/protected paths,</w:t>
       </w:r>
     </w:p>
     <w:p>
@@ -2231,86 +2298,30 @@
           <w:sz w:val="18"/>
           <w:szCs w:val="18"/>
         </w:rPr>
-        <w:t>the live design agent query the same source. Unknown or stale capability references fail before</w:t>
-      </w:r>
-    </w:p>
-    <w:p>
-      <w:pPr/>
-      <w:r>
-        <w:rPr>
-          <w:rFonts w:ascii="Helvetica Light" w:hAnsi="Helvetica Light" w:cs="Helvetica Light"/>
-          <w:sz w:val="18"/>
-          <w:szCs w:val="18"/>
-        </w:rPr>
-        <w:t>preview.</w:t>
-      </w:r>
-    </w:p>
-    <w:p/>
-    <w:p>
-      <w:pPr/>
-      <w:r>
-        <w:rPr>
-          <w:rFonts w:ascii="Helvetica Light" w:hAnsi="Helvetica Light" w:cs="Helvetica Light"/>
-          <w:sz w:val="18"/>
-          <w:szCs w:val="18"/>
-        </w:rPr>
-        <w:t>P10A-04 PageBlueprint metadata includes ID/version/page type, required and optional families,</w:t>
-      </w:r>
-    </w:p>
-    <w:p>
-      <w:pPr/>
-      <w:r>
-        <w:rPr>
-          <w:rFonts w:ascii="Helvetica Light" w:hAnsi="Helvetica Light" w:cs="Helvetica Light"/>
-          <w:sz w:val="18"/>
-          <w:szCs w:val="18"/>
-        </w:rPr>
-        <w:t>cardinality and order, binding and asset-role requirements, responsive composition and</w:t>
-      </w:r>
-    </w:p>
-    <w:p>
-      <w:pPr/>
-      <w:r>
-        <w:rPr>
-          <w:rFonts w:ascii="Helvetica Light" w:hAnsi="Helvetica Light" w:cs="Helvetica Light"/>
-          <w:sz w:val="18"/>
-          <w:szCs w:val="18"/>
-        </w:rPr>
-        <w:t>compatibility. A blueprint is an independent generation starting point; generated output becomes</w:t>
-      </w:r>
-    </w:p>
-    <w:p>
-      <w:pPr/>
-      <w:r>
-        <w:rPr>
-          <w:rFonts w:ascii="Helvetica Light" w:hAnsi="Helvetica Light" w:cs="Helvetica Light"/>
-          <w:sz w:val="18"/>
-          <w:szCs w:val="18"/>
-        </w:rPr>
-        <w:t>ordinary snapshot state and is not silently rewritten when the blueprint later changes. Dynamic</w:t>
-      </w:r>
-    </w:p>
-    <w:p>
-      <w:pPr/>
-      <w:r>
-        <w:rPr>
-          <w:rFonts w:ascii="Helvetica Light" w:hAnsi="Helvetica Light" w:cs="Helvetica Light"/>
-          <w:sz w:val="18"/>
-          <w:szCs w:val="18"/>
-        </w:rPr>
-        <w:t>PDP and collection composition stays stable while runtime bindings resolve different entities.</w:t>
-      </w:r>
-    </w:p>
-    <w:p/>
-    <w:p>
-      <w:pPr/>
-      <w:r>
-        <w:rPr>
-          <w:rFonts w:ascii="Helvetica Light" w:hAnsi="Helvetica Light" w:cs="Helvetica Light"/>
-          <w:sz w:val="18"/>
-          <w:szCs w:val="18"/>
-        </w:rPr>
-        <w:t>P10A-05 targets versioned Skill packages for storefront orchestration, initial generation,</w:t>
+        <w:t>the live design agent query the same source. Registry generation cannot pass without the P10A-03</w:t>
+      </w:r>
+    </w:p>
+    <w:p>
+      <w:pPr/>
+      <w:r>
+        <w:rPr>
+          <w:rFonts w:ascii="Helvetica Light" w:hAnsi="Helvetica Light" w:cs="Helvetica Light"/>
+          <w:sz w:val="18"/>
+          <w:szCs w:val="18"/>
+        </w:rPr>
+        <w:t>PageBlueprint contracts; unknown or stale capability references fail before preview.</w:t>
+      </w:r>
+    </w:p>
+    <w:p/>
+    <w:p>
+      <w:pPr/>
+      <w:r>
+        <w:rPr>
+          <w:rFonts w:ascii="Helvetica Light" w:hAnsi="Helvetica Light" w:cs="Helvetica Light"/>
+          <w:sz w:val="18"/>
+          <w:szCs w:val="18"/>
+        </w:rPr>
+        <w:t>P10A-05 defines versioned Skill package contracts for storefront orchestration, initial generation,</w:t>
       </w:r>
     </w:p>
     <w:p>
@@ -2343,107 +2354,163 @@
           <w:sz w:val="18"/>
           <w:szCs w:val="18"/>
         </w:rPr>
-        <w:t>localization and validation/publish. Each package defines its instructions, required capability</w:t>
-      </w:r>
-    </w:p>
-    <w:p>
-      <w:pPr/>
-      <w:r>
-        <w:rPr>
-          <w:rFonts w:ascii="Helvetica Light" w:hAnsi="Helvetica Light" w:cs="Helvetica Light"/>
-          <w:sz w:val="18"/>
-          <w:szCs w:val="18"/>
-        </w:rPr>
-        <w:t>queries, allowed operations, exact input/output schemas, examples, deterministic fixtures, negative</w:t>
-      </w:r>
-    </w:p>
-    <w:p>
-      <w:pPr/>
-      <w:r>
-        <w:rPr>
-          <w:rFonts w:ascii="Helvetica Light" w:hAnsi="Helvetica Light" w:cs="Helvetica Light"/>
-          <w:sz w:val="18"/>
-          <w:szCs w:val="18"/>
-        </w:rPr>
-        <w:t>and validation cases and permission scope. A whole-store generation Skill is never reused for one</w:t>
-      </w:r>
-    </w:p>
-    <w:p>
-      <w:pPr/>
-      <w:r>
-        <w:rPr>
-          <w:rFonts w:ascii="Helvetica Light" w:hAnsi="Helvetica Light" w:cs="Helvetica Light"/>
-          <w:sz w:val="18"/>
-          <w:szCs w:val="18"/>
-        </w:rPr>
-        <w:t>hero or page.</w:t>
-      </w:r>
-    </w:p>
-    <w:p/>
-    <w:p>
-      <w:pPr/>
-      <w:r>
-        <w:rPr>
-          <w:rFonts w:ascii="Helvetica Light" w:hAnsi="Helvetica Light" w:cs="Helvetica Light"/>
-          <w:sz w:val="18"/>
-          <w:szCs w:val="18"/>
-        </w:rPr>
-        <w:t>P10A-06 uses the canonical scopes selected section/component, current page, shared storefront frame,</w:t>
-      </w:r>
-    </w:p>
-    <w:p>
-      <w:pPr/>
-      <w:r>
-        <w:rPr>
-          <w:rFonts w:ascii="Helvetica Light" w:hAnsi="Helvetica Light" w:cs="Helvetica Light"/>
-          <w:sz w:val="18"/>
-          <w:szCs w:val="18"/>
-        </w:rPr>
-        <w:t>design system and complete storefront. “Shared storefront frame” means navigation, header,</w:t>
-      </w:r>
-    </w:p>
-    <w:p>
-      <w:pPr/>
-      <w:r>
-        <w:rPr>
-          <w:rFonts w:ascii="Helvetica Light" w:hAnsi="Helvetica Light" w:cs="Helvetica Light"/>
-          <w:sz w:val="18"/>
-          <w:szCs w:val="18"/>
-        </w:rPr>
-        <w:t>announcement bar and footer. The router explains unavailable capabilities, offers valid</w:t>
-      </w:r>
-    </w:p>
-    <w:p>
-      <w:pPr/>
-      <w:r>
-        <w:rPr>
-          <w:rFonts w:ascii="Helvetica Light" w:hAnsi="Helvetica Light" w:cs="Helvetica Light"/>
-          <w:sz w:val="18"/>
-          <w:szCs w:val="18"/>
-        </w:rPr>
-        <w:t>alternatives and obtains approval before widening; “change this hero” cannot regenerate the site,</w:t>
-      </w:r>
-    </w:p>
-    <w:p>
-      <w:pPr/>
-      <w:r>
-        <w:rPr>
-          <w:rFonts w:ascii="Helvetica Light" w:hAnsi="Helvetica Light" w:cs="Helvetica Light"/>
-          <w:sz w:val="18"/>
-          <w:szCs w:val="18"/>
-        </w:rPr>
-        <w:t>“make this PDP technical” cannot modify home, “navigation and footer” may target the shared frame</w:t>
-      </w:r>
-    </w:p>
-    <w:p>
-      <w:pPr/>
-      <w:r>
-        <w:rPr>
-          <w:rFonts w:ascii="Helvetica Light" w:hAnsi="Helvetica Light" w:cs="Helvetica Light"/>
-          <w:sz w:val="18"/>
-          <w:szCs w:val="18"/>
-        </w:rPr>
-        <w:t>and “use this palette everywhere” may target the design system.</w:t>
+        <w:t>localization and validation/publish. Each contract declares its instructions, authority, required</w:t>
+      </w:r>
+    </w:p>
+    <w:p>
+      <w:pPr/>
+      <w:r>
+        <w:rPr>
+          <w:rFonts w:ascii="Helvetica Light" w:hAnsi="Helvetica Light" w:cs="Helvetica Light"/>
+          <w:sz w:val="18"/>
+          <w:szCs w:val="18"/>
+        </w:rPr>
+        <w:t>capability queries, allowed operations, exact input/output schemas, examples, deterministic</w:t>
+      </w:r>
+    </w:p>
+    <w:p>
+      <w:pPr/>
+      <w:r>
+        <w:rPr>
+          <w:rFonts w:ascii="Helvetica Light" w:hAnsi="Helvetica Light" w:cs="Helvetica Light"/>
+          <w:sz w:val="18"/>
+          <w:szCs w:val="18"/>
+        </w:rPr>
+        <w:t>fixtures, negative and validation cases and scope classification. A whole-store generation Skill</w:t>
+      </w:r>
+    </w:p>
+    <w:p>
+      <w:pPr/>
+      <w:r>
+        <w:rPr>
+          <w:rFonts w:ascii="Helvetica Light" w:hAnsi="Helvetica Light" w:cs="Helvetica Light"/>
+          <w:sz w:val="18"/>
+          <w:szCs w:val="18"/>
+        </w:rPr>
+        <w:t>contract is never reused for one hero or page. This task does not make those editing packages</w:t>
+      </w:r>
+    </w:p>
+    <w:p>
+      <w:pPr/>
+      <w:r>
+        <w:rPr>
+          <w:rFonts w:ascii="Helvetica Light" w:hAnsi="Helvetica Light" w:cs="Helvetica Light"/>
+          <w:sz w:val="18"/>
+          <w:szCs w:val="18"/>
+        </w:rPr>
+        <w:t>merchant-operable.</w:t>
+      </w:r>
+    </w:p>
+    <w:p/>
+    <w:p>
+      <w:pPr/>
+      <w:r>
+        <w:rPr>
+          <w:rFonts w:ascii="Helvetica Light" w:hAnsi="Helvetica Light" w:cs="Helvetica Light"/>
+          <w:sz w:val="18"/>
+          <w:szCs w:val="18"/>
+        </w:rPr>
+        <w:t>P10A-06 defines router contracts over the canonical scopes selected section/component, current</w:t>
+      </w:r>
+    </w:p>
+    <w:p>
+      <w:pPr/>
+      <w:r>
+        <w:rPr>
+          <w:rFonts w:ascii="Helvetica Light" w:hAnsi="Helvetica Light" w:cs="Helvetica Light"/>
+          <w:sz w:val="18"/>
+          <w:szCs w:val="18"/>
+        </w:rPr>
+        <w:t>page, shared storefront frame, design system and complete storefront. “Shared storefront frame”</w:t>
+      </w:r>
+    </w:p>
+    <w:p>
+      <w:pPr/>
+      <w:r>
+        <w:rPr>
+          <w:rFonts w:ascii="Helvetica Light" w:hAnsi="Helvetica Light" w:cs="Helvetica Light"/>
+          <w:sz w:val="18"/>
+          <w:szCs w:val="18"/>
+        </w:rPr>
+        <w:t>means navigation, header, announcement bar and footer. The contracts classify scope, declare</w:t>
+      </w:r>
+    </w:p>
+    <w:p>
+      <w:pPr/>
+      <w:r>
+        <w:rPr>
+          <w:rFonts w:ascii="Helvetica Light" w:hAnsi="Helvetica Light" w:cs="Helvetica Light"/>
+          <w:sz w:val="18"/>
+          <w:szCs w:val="18"/>
+        </w:rPr>
+        <w:t>authority and require validation that rejects silent widening: “change this hero” cannot classify</w:t>
+      </w:r>
+    </w:p>
+    <w:p>
+      <w:pPr/>
+      <w:r>
+        <w:rPr>
+          <w:rFonts w:ascii="Helvetica Light" w:hAnsi="Helvetica Light" w:cs="Helvetica Light"/>
+          <w:sz w:val="18"/>
+          <w:szCs w:val="18"/>
+        </w:rPr>
+        <w:t>as site-wide, “make this PDP technical” cannot include home, “navigation and footer” may classify as</w:t>
+      </w:r>
+    </w:p>
+    <w:p>
+      <w:pPr/>
+      <w:r>
+        <w:rPr>
+          <w:rFonts w:ascii="Helvetica Light" w:hAnsi="Helvetica Light" w:cs="Helvetica Light"/>
+          <w:sz w:val="18"/>
+          <w:szCs w:val="18"/>
+        </w:rPr>
+        <w:t>shared frame and “use this palette everywhere” may classify as design system. Runtime explanations,</w:t>
+      </w:r>
+    </w:p>
+    <w:p>
+      <w:pPr/>
+      <w:r>
+        <w:rPr>
+          <w:rFonts w:ascii="Helvetica Light" w:hAnsi="Helvetica Light" w:cs="Helvetica Light"/>
+          <w:sz w:val="18"/>
+          <w:szCs w:val="18"/>
+        </w:rPr>
+        <w:t>approval controls and proposal execution belong to Phase 11.</w:t>
+      </w:r>
+    </w:p>
+    <w:p/>
+    <w:p>
+      <w:pPr/>
+      <w:r>
+        <w:rPr>
+          <w:rFonts w:ascii="Helvetica Light" w:hAnsi="Helvetica Light" w:cs="Helvetica Light"/>
+          <w:sz w:val="18"/>
+          <w:szCs w:val="18"/>
+        </w:rPr>
+        <w:t>**Phase boundary:** P10A defines and validates the scopes. P10A does not deliver</w:t>
+      </w:r>
+    </w:p>
+    <w:p>
+      <w:pPr/>
+      <w:r>
+        <w:rPr>
+          <w:rFonts w:ascii="Helvetica Light" w:hAnsi="Helvetica Light" w:cs="Helvetica Light"/>
+          <w:sz w:val="18"/>
+          <w:szCs w:val="18"/>
+        </w:rPr>
+        <w:t>merchant-operable granular editing. Phase 11 implements and exposes those scopes as working merchant</w:t>
+      </w:r>
+    </w:p>
+    <w:p>
+      <w:pPr/>
+      <w:r>
+        <w:rPr>
+          <w:rFonts w:ascii="Helvetica Light" w:hAnsi="Helvetica Light" w:cs="Helvetica Light"/>
+          <w:sz w:val="18"/>
+          <w:szCs w:val="18"/>
+        </w:rPr>
+        <w:t>features.</w:t>
       </w:r>
     </w:p>
     <w:p/>
@@ -2510,7 +2577,18 @@
           <w:sz w:val="18"/>
           <w:szCs w:val="18"/>
         </w:rPr>
-        <w:t>exact atomic Undo/Redo.</w:t>
+        <w:t>the contract validations owned by P10A. Runtime mixed-scope history and Undo/Redo for granular</w:t>
+      </w:r>
+    </w:p>
+    <w:p>
+      <w:pPr/>
+      <w:r>
+        <w:rPr>
+          <w:rFonts w:ascii="Helvetica Light" w:hAnsi="Helvetica Light" w:cs="Helvetica Light"/>
+          <w:sz w:val="18"/>
+          <w:szCs w:val="18"/>
+        </w:rPr>
+        <w:t>editing are Phase 11 gates.</w:t>
       </w:r>
     </w:p>
     <w:p/>
@@ -2825,62 +2903,95 @@
           <w:sz w:val="18"/>
           <w:szCs w:val="18"/>
         </w:rPr>
-        <w:t>Phase 11 provides stable section identity and explicit selected section/component, current page,</w:t>
-      </w:r>
-    </w:p>
-    <w:p>
-      <w:pPr/>
-      <w:r>
-        <w:rPr>
-          <w:rFonts w:ascii="Helvetica Light" w:hAnsi="Helvetica Light" w:cs="Helvetica Light"/>
-          <w:sz w:val="18"/>
-          <w:szCs w:val="18"/>
-        </w:rPr>
-        <w:t>shared storefront frame, design system and complete storefront edits. It covers add/remove,</w:t>
-      </w:r>
-    </w:p>
-    <w:p>
-      <w:pPr/>
-      <w:r>
-        <w:rPr>
-          <w:rFonts w:ascii="Helvetica Light" w:hAnsi="Helvetica Light" w:cs="Helvetica Light"/>
-          <w:sz w:val="18"/>
-          <w:szCs w:val="18"/>
-        </w:rPr>
-        <w:t>supported duplication, variant replacement, reorder, page regeneration, mixed-scope atomic history,</w:t>
-      </w:r>
-    </w:p>
-    <w:p>
-      <w:pPr/>
-      <w:r>
-        <w:rPr>
-          <w:rFonts w:ascii="Helvetica Light" w:hAnsi="Helvetica Light" w:cs="Helvetica Light"/>
-          <w:sz w:val="18"/>
-          <w:szCs w:val="18"/>
-        </w:rPr>
-        <w:t>local coherence and strict no-widening. Common targets include header/navigation/announcement,</w:t>
-      </w:r>
-    </w:p>
-    <w:p>
-      <w:pPr/>
-      <w:r>
-        <w:rPr>
-          <w:rFonts w:ascii="Helvetica Light" w:hAnsi="Helvetica Light" w:cs="Helvetica Light"/>
-          <w:sz w:val="18"/>
-          <w:szCs w:val="18"/>
-        </w:rPr>
-        <w:t>hero, featured collections/products, brand story, campaign/trust, collection discovery/grid, PDP</w:t>
-      </w:r>
-    </w:p>
-    <w:p>
-      <w:pPr/>
-      <w:r>
-        <w:rPr>
-          <w:rFonts w:ascii="Helvetica Light" w:hAnsi="Helvetica Light" w:cs="Helvetica Light"/>
-          <w:sz w:val="18"/>
-          <w:szCs w:val="18"/>
-        </w:rPr>
-        <w:t>gallery/information/options/specifications and footer.</w:t>
+        <w:t>Phase 11 implements and exposes the scopes defined and validated by P10A as working merchant</w:t>
+      </w:r>
+    </w:p>
+    <w:p>
+      <w:pPr/>
+      <w:r>
+        <w:rPr>
+          <w:rFonts w:ascii="Helvetica Light" w:hAnsi="Helvetica Light" w:cs="Helvetica Light"/>
+          <w:sz w:val="18"/>
+          <w:szCs w:val="18"/>
+        </w:rPr>
+        <w:t>features. It owns selecting a component or section; applying a selected-section proposal;</w:t>
+      </w:r>
+    </w:p>
+    <w:p>
+      <w:pPr/>
+      <w:r>
+        <w:rPr>
+          <w:rFonts w:ascii="Helvetica Light" w:hAnsi="Helvetica Light" w:cs="Helvetica Light"/>
+          <w:sz w:val="18"/>
+          <w:szCs w:val="18"/>
+        </w:rPr>
+        <w:t>current-page editing; shared storefront frame editing; design-system editing; complete-storefront</w:t>
+      </w:r>
+    </w:p>
+    <w:p>
+      <w:pPr/>
+      <w:r>
+        <w:rPr>
+          <w:rFonts w:ascii="Helvetica Light" w:hAnsi="Helvetica Light" w:cs="Helvetica Light"/>
+          <w:sz w:val="18"/>
+          <w:szCs w:val="18"/>
+        </w:rPr>
+        <w:t>editing; add, remove, reorder and replace operations; proposal preview and acceptance; mixed-scope</w:t>
+      </w:r>
+    </w:p>
+    <w:p>
+      <w:pPr/>
+      <w:r>
+        <w:rPr>
+          <w:rFonts w:ascii="Helvetica Light" w:hAnsi="Helvetica Light" w:cs="Helvetica Light"/>
+          <w:sz w:val="18"/>
+          <w:szCs w:val="18"/>
+        </w:rPr>
+        <w:t>history; Undo/Redo; and merchant scope controls and warnings. It provides stable section identity,</w:t>
+      </w:r>
+    </w:p>
+    <w:p>
+      <w:pPr/>
+      <w:r>
+        <w:rPr>
+          <w:rFonts w:ascii="Helvetica Light" w:hAnsi="Helvetica Light" w:cs="Helvetica Light"/>
+          <w:sz w:val="18"/>
+          <w:szCs w:val="18"/>
+        </w:rPr>
+        <w:t>local coherence and runtime enforcement of the P10A prohibition against silent scope widening.</w:t>
+      </w:r>
+    </w:p>
+    <w:p>
+      <w:pPr/>
+      <w:r>
+        <w:rPr>
+          <w:rFonts w:ascii="Helvetica Light" w:hAnsi="Helvetica Light" w:cs="Helvetica Light"/>
+          <w:sz w:val="18"/>
+          <w:szCs w:val="18"/>
+        </w:rPr>
+        <w:t>Common targets include header/navigation/announcement, hero, featured collections/products, brand</w:t>
+      </w:r>
+    </w:p>
+    <w:p>
+      <w:pPr/>
+      <w:r>
+        <w:rPr>
+          <w:rFonts w:ascii="Helvetica Light" w:hAnsi="Helvetica Light" w:cs="Helvetica Light"/>
+          <w:sz w:val="18"/>
+          <w:szCs w:val="18"/>
+        </w:rPr>
+        <w:t>story, campaign/trust, collection discovery/grid, PDP gallery/information/options/specifications and</w:t>
+      </w:r>
+    </w:p>
+    <w:p>
+      <w:pPr/>
+      <w:r>
+        <w:rPr>
+          <w:rFonts w:ascii="Helvetica Light" w:hAnsi="Helvetica Light" w:cs="Helvetica Light"/>
+          <w:sz w:val="18"/>
+          <w:szCs w:val="18"/>
+        </w:rPr>
+        <w:t>footer.</w:t>
       </w:r>
     </w:p>
     <w:p/>
@@ -14942,7 +15053,7 @@
           <w:sz w:val="18"/>
           <w:szCs w:val="18"/>
         </w:rPr>
-        <w:t>| **AC-129** | Capability retrieval returns only current registered components, variants, bindings, renderers, responsive/accessibility rules and executable blueprints derived from canonical repository contracts. | FR-108, FR-109, NFR-108, NFR-109 |</w:t>
+        <w:t>| **AC-129** | After executable PageBlueprint contracts exist, capability retrieval returns only current registered components, variants, bindings, renderers, responsive/accessibility rules and executable blueprints derived from canonical repository contracts. | FR-108, FR-109, NFR-108, NFR-109 |</w:t>
       </w:r>
     </w:p>
     <w:p>
@@ -14964,18 +15075,18 @@
           <w:sz w:val="18"/>
           <w:szCs w:val="18"/>
         </w:rPr>
-        <w:t>| **AC-131** | Initial storefront generation and follow-up editing use separately identified Skill packages with separate inputs, permissions, quality gates and evidence. | FR-105, FR-108, FR-113, NFR-101, NFR-108 |</w:t>
-      </w:r>
-    </w:p>
-    <w:p>
-      <w:pPr/>
-      <w:r>
-        <w:rPr>
-          <w:rFonts w:ascii="Helvetica Light" w:hAnsi="Helvetica Light" w:cs="Helvetica Light"/>
-          <w:sz w:val="18"/>
-          <w:szCs w:val="18"/>
-        </w:rPr>
-        <w:t>| **AC-132** | The instruction router never widens authority beyond the merchant-selected section, page, shared frame, design system or complete-storefront scope. | FR-108, FR-113, NFR-101, NFR-105 |</w:t>
+        <w:t>| **AC-131** | Initial storefront generation and follow-up editing have separately identified Skill package contracts with separate schemas, declared authority, quality gates and evidence. Runtime merchant execution remains a Phase 11 responsibility. | FR-105, FR-108, FR-113, NFR-101, NFR-108 |</w:t>
+      </w:r>
+    </w:p>
+    <w:p>
+      <w:pPr/>
+      <w:r>
+        <w:rPr>
+          <w:rFonts w:ascii="Helvetica Light" w:hAnsi="Helvetica Light" w:cs="Helvetica Light"/>
+          <w:sz w:val="18"/>
+          <w:szCs w:val="18"/>
+        </w:rPr>
+        <w:t>| **AC-132** | Scope-classification and instruction-router contracts reject any plan whose declared authority silently widens beyond the selected section, page, shared frame, design system or complete-storefront scope. Runtime merchant controls and execution remain Phase 11 responsibilities. | FR-108, FR-113, NFR-101, NFR-105 |</w:t>
       </w:r>
     </w:p>
     <w:p>
@@ -15704,29 +15815,29 @@
           <w:sz w:val="18"/>
           <w:szCs w:val="18"/>
         </w:rPr>
-        <w:t>| **P10A — Grounded orchestration** | Vocabulary freeze, repository capability audit, generated Component Knowledge Registry, executable PageBlueprints, separate Skill packages, scoped instruction router, golden-store evaluation and deterministic publish compiler. | Generation retrieves what the product can actually build and compiles to the canonical snapshot. | AC-129 through AC-135 pass without a second registry, page graph or publish model. |</w:t>
-      </w:r>
-    </w:p>
-    <w:p>
-      <w:pPr/>
-      <w:r>
-        <w:rPr>
-          <w:rFonts w:ascii="Helvetica Light" w:hAnsi="Helvetica Light" w:cs="Helvetica Light"/>
-          <w:sz w:val="18"/>
-          <w:szCs w:val="18"/>
-        </w:rPr>
-        <w:t>| **P10B — Assets and Storefront Studio UX** | Upload/library, roles/provenance, generated-image lifecycle and merchant-facing Studio flows that consume P10A contracts. | Merchants can govern assets and use generation without developer concepts. | AC-119 plus Studio-owned AC-121/122/123 evidence pass. |</w:t>
-      </w:r>
-    </w:p>
-    <w:p>
-      <w:pPr/>
-      <w:r>
-        <w:rPr>
-          <w:rFonts w:ascii="Helvetica Light" w:hAnsi="Helvetica Light" w:cs="Helvetica Light"/>
-          <w:sz w:val="18"/>
-          <w:szCs w:val="18"/>
-        </w:rPr>
-        <w:t>| **P11 — Granular editing** | Selected section, current page, shared frame, design system and complete-storefront editing scopes. | Merchants can make controlled local or coordinated changes without unintended scope widening. | Every scope passes permissions, review, atomicity and undo tests. |</w:t>
+        <w:t>| **P10A — Grounded orchestration** | Vocabulary freeze, repository capability audit, executable PageBlueprint contracts, generated Component Knowledge Registry, separate Skill package contracts, scoped instruction-router contracts, golden-store evaluation and deterministic publish compiler. P10A defines and validates scopes but does not deliver merchant-operable granular editing. | Generation retrieves what the product can actually build and compiles to the canonical snapshot. | AC-129 through AC-135 pass without a second registry, page graph or publish model; P10A-04 registry generation consumes P10A-03 blueprint contracts. |</w:t>
+      </w:r>
+    </w:p>
+    <w:p>
+      <w:pPr/>
+      <w:r>
+        <w:rPr>
+          <w:rFonts w:ascii="Helvetica Light" w:hAnsi="Helvetica Light" w:cs="Helvetica Light"/>
+          <w:sz w:val="18"/>
+          <w:szCs w:val="18"/>
+        </w:rPr>
+        <w:t>| **P10B — Assets and Storefront Studio UX** | Upload/library, roles/provenance, generated-image lifecycle and merchant-facing Studio flows that consume P10A contracts. | Merchants can govern assets and use generation without developer concepts. | Studio-owned AC-121/122/123 evidence passes. AC-119 remains solely a Phase 9 gate. |</w:t>
+      </w:r>
+    </w:p>
+    <w:p>
+      <w:pPr/>
+      <w:r>
+        <w:rPr>
+          <w:rFonts w:ascii="Helvetica Light" w:hAnsi="Helvetica Light" w:cs="Helvetica Light"/>
+          <w:sz w:val="18"/>
+          <w:szCs w:val="18"/>
+        </w:rPr>
+        <w:t>| **P11 — Granular editing** | Runtime selection and execution for selected section/component, current page, shared frame, design system and complete storefront; add/remove/reorder/replace; preview, acceptance, mixed-scope history, Undo/Redo and merchant scope controls/warnings. | Merchants can make controlled local or coordinated changes without unintended scope widening. | Every merchant-operable scope passes permissions, review, atomicity, history and Undo/Redo tests against the P10A contracts. |</w:t>
       </w:r>
     </w:p>
     <w:p>
@@ -15783,18 +15894,40 @@
           <w:sz w:val="18"/>
           <w:szCs w:val="18"/>
         </w:rPr>
-        <w:t>capability and blueprint foundations before router, evaluation and publish-compiler consumers.</w:t>
-      </w:r>
-    </w:p>
-    <w:p>
-      <w:pPr/>
-      <w:r>
-        <w:rPr>
-          <w:rFonts w:ascii="Helvetica Light" w:hAnsi="Helvetica Light" w:cs="Helvetica Light"/>
-          <w:sz w:val="18"/>
-          <w:szCs w:val="18"/>
-        </w:rPr>
-        <w:t>P10B consumes those merged contracts. Parallel worktree assignments must still declare owned files,</w:t>
+        <w:t>capability and executable PageBlueprint foundations before generating the Component Knowledge</w:t>
+      </w:r>
+    </w:p>
+    <w:p>
+      <w:pPr/>
+      <w:r>
+        <w:rPr>
+          <w:rFonts w:ascii="Helvetica Light" w:hAnsi="Helvetica Light" w:cs="Helvetica Light"/>
+          <w:sz w:val="18"/>
+          <w:szCs w:val="18"/>
+        </w:rPr>
+        <w:t>Registry, then merge Skill/router contracts before evaluation and publish-compiler consumers. P10B</w:t>
+      </w:r>
+    </w:p>
+    <w:p>
+      <w:pPr/>
+      <w:r>
+        <w:rPr>
+          <w:rFonts w:ascii="Helvetica Light" w:hAnsi="Helvetica Light" w:cs="Helvetica Light"/>
+          <w:sz w:val="18"/>
+          <w:szCs w:val="18"/>
+        </w:rPr>
+        <w:t>consumes those merged contracts; Phase 11 subsequently implements their editing scopes as</w:t>
+      </w:r>
+    </w:p>
+    <w:p>
+      <w:pPr/>
+      <w:r>
+        <w:rPr>
+          <w:rFonts w:ascii="Helvetica Light" w:hAnsi="Helvetica Light" w:cs="Helvetica Light"/>
+          <w:sz w:val="18"/>
+          <w:szCs w:val="18"/>
+        </w:rPr>
+        <w:t>merchant-operable runtime features. Parallel worktree assignments must still declare owned files,</w:t>
       </w:r>
     </w:p>
     <w:p>

</xml_diff>

<commit_message>
docs: resolve final v1.2.1 review findings
</commit_message>
<xml_diff>
--- a/docs/VESKIFY_SDD_v1.2.1.docx
+++ b/docs/VESKIFY_SDD_v1.2.1.docx
@@ -1559,18 +1559,29 @@
           <w:sz w:val="18"/>
           <w:szCs w:val="18"/>
         </w:rPr>
-        <w:t>1. prove meaningful page and shared-frame composition;</w:t>
-      </w:r>
-    </w:p>
-    <w:p>
-      <w:pPr/>
-      <w:r>
-        <w:rPr>
-          <w:rFonts w:ascii="Helvetica Light" w:hAnsi="Helvetica Light" w:cs="Helvetica Light"/>
-          <w:sz w:val="18"/>
-          <w:szCs w:val="18"/>
-        </w:rPr>
-        <w:t>2. prove that every selected capability is registered and reachable;</w:t>
+        <w:t>1. establish the smallest registered and end-to-end reachable capability set required to prove</w:t>
+      </w:r>
+    </w:p>
+    <w:p>
+      <w:pPr/>
+      <w:r>
+        <w:rPr>
+          <w:rFonts w:ascii="Helvetica Light" w:hAnsi="Helvetica Light" w:cs="Helvetica Light"/>
+          <w:sz w:val="18"/>
+          <w:szCs w:val="18"/>
+        </w:rPr>
+        <w:t xml:space="preserve">   meaningful multi-page composition;</w:t>
+      </w:r>
+    </w:p>
+    <w:p>
+      <w:pPr/>
+      <w:r>
+        <w:rPr>
+          <w:rFonts w:ascii="Helvetica Light" w:hAnsi="Helvetica Light" w:cs="Helvetica Light"/>
+          <w:sz w:val="18"/>
+          <w:szCs w:val="18"/>
+        </w:rPr>
+        <w:t>2. prove coordinated page and shared-frame composition;</w:t>
       </w:r>
     </w:p>
     <w:p>
@@ -1603,18 +1614,141 @@
           <w:sz w:val="18"/>
           <w:szCs w:val="18"/>
         </w:rPr>
-        <w:t>5. prove persistence, preview and explicit publication of the accepted snapshot;</w:t>
-      </w:r>
-    </w:p>
-    <w:p>
-      <w:pPr/>
-      <w:r>
-        <w:rPr>
-          <w:rFonts w:ascii="Helvetica Light" w:hAnsi="Helvetica Light" w:cs="Helvetica Light"/>
-          <w:sz w:val="18"/>
-          <w:szCs w:val="18"/>
-        </w:rPr>
-        <w:t>6. only then expand the controlled design vocabulary.</w:t>
+        <w:t>5. prove persistence, preview and explicit publication of the accepted snapshot.</w:t>
+      </w:r>
+    </w:p>
+    <w:p/>
+    <w:p>
+      <w:pPr/>
+      <w:r>
+        <w:rPr>
+          <w:rFonts w:ascii="Helvetica Light" w:hAnsi="Helvetica Light" w:cs="Helvetica Light"/>
+          <w:sz w:val="18"/>
+          <w:szCs w:val="18"/>
+        </w:rPr>
+        <w:t>P9-03 may repair reachability of already registered capabilities, expose the smallest curated set</w:t>
+      </w:r>
+    </w:p>
+    <w:p>
+      <w:pPr/>
+      <w:r>
+        <w:rPr>
+          <w:rFonts w:ascii="Helvetica Light" w:hAnsi="Helvetica Light" w:cs="Helvetica Light"/>
+          <w:sz w:val="18"/>
+          <w:szCs w:val="18"/>
+        </w:rPr>
+        <w:t>required by the Phase 9 directions, correct planner/compiler/renderer gaps and enable the minimum</w:t>
+      </w:r>
+    </w:p>
+    <w:p>
+      <w:pPr/>
+      <w:r>
+        <w:rPr>
+          <w:rFonts w:ascii="Helvetica Light" w:hAnsi="Helvetica Light" w:cs="Helvetica Light"/>
+          <w:sz w:val="18"/>
+          <w:szCs w:val="18"/>
+        </w:rPr>
+        <w:t>editorial, modern-technical and warm compositions needed for acceptance. It MUST NOT become broad</w:t>
+      </w:r>
+    </w:p>
+    <w:p>
+      <w:pPr/>
+      <w:r>
+        <w:rPr>
+          <w:rFonts w:ascii="Helvetica Light" w:hAnsi="Helvetica Light" w:cs="Helvetica Light"/>
+          <w:sz w:val="18"/>
+          <w:szCs w:val="18"/>
+        </w:rPr>
+        <w:t>or unrestricted vocabulary scaling. Broad controlled-vocabulary expansion occurs after the Phase</w:t>
+      </w:r>
+    </w:p>
+    <w:p>
+      <w:pPr/>
+      <w:r>
+        <w:rPr>
+          <w:rFonts w:ascii="Helvetica Light" w:hAnsi="Helvetica Light" w:cs="Helvetica Light"/>
+          <w:sz w:val="18"/>
+          <w:szCs w:val="18"/>
+        </w:rPr>
+        <w:t>9 proof gates, through P10A-04’s generated registry and canonical validation.</w:t>
+      </w:r>
+    </w:p>
+    <w:p/>
+    <w:p>
+      <w:pPr/>
+      <w:r>
+        <w:rPr>
+          <w:rFonts w:ascii="Helvetica Light" w:hAnsi="Helvetica Light" w:cs="Helvetica Light"/>
+          <w:sz w:val="18"/>
+          <w:szCs w:val="18"/>
+        </w:rPr>
+        <w:t>Phase 9 retained brief-handoff evidence MUST show this complete lifecycle: authoritative</w:t>
+      </w:r>
+    </w:p>
+    <w:p>
+      <w:pPr/>
+      <w:r>
+        <w:rPr>
+          <w:rFonts w:ascii="Helvetica Light" w:hAnsi="Helvetica Light" w:cs="Helvetica Light"/>
+          <w:sz w:val="18"/>
+          <w:szCs w:val="18"/>
+        </w:rPr>
+        <w:t>Storefront Design Brief creation → merchant review → explicit approval → approved</w:t>
+      </w:r>
+    </w:p>
+    <w:p>
+      <w:pPr/>
+      <w:r>
+        <w:rPr>
+          <w:rFonts w:ascii="Helvetica Light" w:hAnsi="Helvetica Light" w:cs="Helvetica Light"/>
+          <w:sz w:val="18"/>
+          <w:szCs w:val="18"/>
+        </w:rPr>
+        <w:t>revision/fingerprint recording → runtime generation receiving that exact revision → correlated</w:t>
+      </w:r>
+    </w:p>
+    <w:p>
+      <w:pPr/>
+      <w:r>
+        <w:rPr>
+          <w:rFonts w:ascii="Helvetica Light" w:hAnsi="Helvetica Light" w:cs="Helvetica Light"/>
+          <w:sz w:val="18"/>
+          <w:szCs w:val="18"/>
+        </w:rPr>
+        <w:t>proposal → storefront review and acceptance. The retained package MUST include project ID, brief</w:t>
+      </w:r>
+    </w:p>
+    <w:p>
+      <w:pPr/>
+      <w:r>
+        <w:rPr>
+          <w:rFonts w:ascii="Helvetica Light" w:hAnsi="Helvetica Light" w:cs="Helvetica Light"/>
+          <w:sz w:val="18"/>
+          <w:szCs w:val="18"/>
+        </w:rPr>
+        <w:t>ID, approval state, actor/action/timestamp and runtime request correlation, and MUST prove that no</w:t>
+      </w:r>
+    </w:p>
+    <w:p>
+      <w:pPr/>
+      <w:r>
+        <w:rPr>
+          <w:rFonts w:ascii="Helvetica Light" w:hAnsi="Helvetica Light" w:cs="Helvetica Light"/>
+          <w:sz w:val="18"/>
+          <w:szCs w:val="18"/>
+        </w:rPr>
+        <w:t>later unapproved brief mutation supplied generation. A deterministic fixture or a validated but</w:t>
+      </w:r>
+    </w:p>
+    <w:p>
+      <w:pPr/>
+      <w:r>
+        <w:rPr>
+          <w:rFonts w:ascii="Helvetica Light" w:hAnsi="Helvetica Light" w:cs="Helvetica Light"/>
+          <w:sz w:val="18"/>
+          <w:szCs w:val="18"/>
+        </w:rPr>
+        <w:t>unapproved brief is not closing evidence.</w:t>
       </w:r>
     </w:p>
     <w:p/>
@@ -1918,7 +2052,18 @@
           <w:sz w:val="18"/>
           <w:szCs w:val="18"/>
         </w:rPr>
-        <w:t>fixture leakage, real-provider evidence and the accepted snapshot’s save/preview/publish path.</w:t>
+        <w:t>fixture leakage, real-provider evidence, the approved Storefront Design Brief-to-runtime handoff</w:t>
+      </w:r>
+    </w:p>
+    <w:p>
+      <w:pPr/>
+      <w:r>
+        <w:rPr>
+          <w:rFonts w:ascii="Helvetica Light" w:hAnsi="Helvetica Light" w:cs="Helvetica Light"/>
+          <w:sz w:val="18"/>
+          <w:szCs w:val="18"/>
+        </w:rPr>
+        <w:t>required by FR-105 and the accepted snapshot’s save/preview/publish path.</w:t>
       </w:r>
     </w:p>
     <w:p/>
@@ -2020,7 +2165,29 @@
           <w:sz w:val="18"/>
           <w:szCs w:val="18"/>
         </w:rPr>
-        <w:t xml:space="preserve">   canonical contracts, including the executable PageBlueprint contracts produced by P10A-03.</w:t>
+        <w:t xml:space="preserve">   canonical contracts, including the executable PageBlueprint contracts produced by P10A-03,</w:t>
+      </w:r>
+    </w:p>
+    <w:p>
+      <w:pPr/>
+      <w:r>
+        <w:rPr>
+          <w:rFonts w:ascii="Helvetica Light" w:hAnsi="Helvetica Light" w:cs="Helvetica Light"/>
+          <w:sz w:val="18"/>
+          <w:szCs w:val="18"/>
+        </w:rPr>
+        <w:t xml:space="preserve">   and broaden the controlled vocabulary only through validated canonical registrations exposed</w:t>
+      </w:r>
+    </w:p>
+    <w:p>
+      <w:pPr/>
+      <w:r>
+        <w:rPr>
+          <w:rFonts w:ascii="Helvetica Light" w:hAnsi="Helvetica Light" w:cs="Helvetica Light"/>
+          <w:sz w:val="18"/>
+          <w:szCs w:val="18"/>
+        </w:rPr>
+        <w:t xml:space="preserve">   by that generated view after the Phase 9 proof gate.</w:t>
       </w:r>
     </w:p>
     <w:p>
@@ -15009,7 +15176,7 @@
           <w:sz w:val="18"/>
           <w:szCs w:val="18"/>
         </w:rPr>
-        <w:t>| **AC-125** | A complete customer-ready journey succeeds: URL or minimal-input onboarding → approved brief → generation → AI edit → manual edit → save draft → preview → publish → restore. | FR-101, FR-103, FR-105, FR-108, FR-115, FR-118, NFR-105, NFR-108, NFR-109 |</w:t>
+        <w:t>| **AC-125** | A complete customer-ready journey succeeds: URL or minimal-input onboarding → merchant-approved brief whose exact approved revision/fingerprint is correlated to runtime generation → AI edit → manual edit → save draft → preview → publish → restore. | FR-101, FR-103, FR-105, FR-108, FR-115, FR-118, NFR-105, NFR-108, NFR-109 |</w:t>
       </w:r>
     </w:p>
     <w:p>
@@ -15804,18 +15971,18 @@
           <w:sz w:val="18"/>
           <w:szCs w:val="18"/>
         </w:rPr>
-        <w:t>| **P9 — Meaningful grounded storefront generation** | Coordinated shared frame, homepage, collection and PDP composition from registered capabilities; commerce/assets; atomic apply/undo; persistence, preview and publish; responsive, accessibility and real-provider evidence. | A merchant receives a coherent editable storefront rather than token-only or one-section variation. | The Phase 9 evidence matrix is complete; no token-only, fixture-leaking, renderer-only or API-response-only result may pass. |</w:t>
-      </w:r>
-    </w:p>
-    <w:p>
-      <w:pPr/>
-      <w:r>
-        <w:rPr>
-          <w:rFonts w:ascii="Helvetica Light" w:hAnsi="Helvetica Light" w:cs="Helvetica Light"/>
-          <w:sz w:val="18"/>
-          <w:szCs w:val="18"/>
-        </w:rPr>
-        <w:t>| **P10A — Grounded orchestration** | Vocabulary freeze, repository capability audit, executable PageBlueprint contracts, generated Component Knowledge Registry, separate Skill package contracts, scoped instruction-router contracts, golden-store evaluation and deterministic publish compiler. P10A defines and validates scopes but does not deliver merchant-operable granular editing. | Generation retrieves what the product can actually build and compiles to the canonical snapshot. | AC-129 through AC-135 pass without a second registry, page graph or publish model; P10A-04 registry generation consumes P10A-03 blueprint contracts. |</w:t>
+        <w:t>| **P9 — Meaningful grounded storefront generation** | Minimum proof-enabling registered capability reachability; coordinated shared frame, homepage, collection and PDP composition; approved-brief runtime handoff; commerce/assets; atomic apply/undo; persistence, preview and publish; responsive, accessibility and real-provider evidence. | A merchant receives a coherent editable storefront from the exact approved brief revision rather than token-only or one-section variation. | The Phase 9 evidence matrix is complete, including retained FR-105 approval-to-runtime correlation; no token-only, fixture-leaking, renderer-only, unapproved-brief or API-response-only result may pass. |</w:t>
+      </w:r>
+    </w:p>
+    <w:p>
+      <w:pPr/>
+      <w:r>
+        <w:rPr>
+          <w:rFonts w:ascii="Helvetica Light" w:hAnsi="Helvetica Light" w:cs="Helvetica Light"/>
+          <w:sz w:val="18"/>
+          <w:szCs w:val="18"/>
+        </w:rPr>
+        <w:t>| **P10A — Grounded orchestration** | Vocabulary freeze, repository capability audit, executable PageBlueprint contracts, generated Component Knowledge Registry and post-Phase-9 controlled vocabulary scaling, separate Skill package contracts, scoped instruction-router contracts, golden-store evaluation and deterministic publish compiler. P10A defines and validates scopes but does not deliver merchant-operable granular editing. | Generation retrieves what the product can actually build and compiles to the canonical snapshot. | AC-129 through AC-135 pass without a second registry, page graph or publish model; P10A-04 registry generation consumes P10A-03 blueprint contracts and is the only broad vocabulary-scaling activity. |</w:t>
       </w:r>
     </w:p>
     <w:p>

</xml_diff>